<commit_message>
docs(entrega-sepsa): diagrama, tablas y manual del técnico en el documento oficial
Agrega al punto 2 el diagrama entidad-relación de la base (en hoja horizontal) y la lista de las 13 tablas con nombres en español. Agrega al punto 3 el paso a paso del técnico de campo, con las tres capturas de la aplicación. El punto 2 y el punto 3 ocupan ahora tres hojas cada uno. No cambia el texto del resto del documento.
</commit_message>
<xml_diff>
--- a/docs/entrega-sepsa/entrega-oficial-SEPSA.docx
+++ b/docs/entrega-sepsa/entrega-oficial-SEPSA.docx
@@ -548,7 +548,7 @@
           <w:sz w:val="24"/>
           <w:szCs w:val="24"/>
         </w:rPr>
-        <w:t xml:space="preserve">La base de datos tiene 13 tablas que agrupan la información en siete bloques: usuarios y sesiones; morosos y suministros; órdenes y asignaciones; autorizaciones de corte y reconexión; operaciones enviadas desde los dispositivos; fotografías de evidencia; y auditoría. La base impide duplicar órdenes activas y reutilizar autorizaciones, y la auditoría solo admite registros nuevos.</w:t>
+        <w:t xml:space="preserve">La base de datos tiene 13 tablas que agrupan la información en siete bloques: usuarios y sesiones; morosos y suministros; órdenes y asignaciones; autorizaciones de corte y reconexión; operaciones enviadas desde los dispositivos; fotografías de evidencia; y auditoría. La base impide duplicar órdenes activas y reutilizar autorizaciones, y la auditoría solo admite registros nuevos. La Figura 1 muestra las tablas y sus relaciones.</w:t>
       </w:r>
     </w:p>
     <w:p>
@@ -564,6 +564,269 @@
           <w:sz w:val="24"/>
           <w:szCs w:val="24"/>
         </w:rPr>
+        <w:t xml:space="preserve">Nombres de las Tablas</w:t>
+      </w:r>
+    </w:p>
+    <w:p>
+      <w:pPr>
+        <w:pStyle w:val="ListParagraph"/>
+        <w:numPr>
+          <w:ilvl w:val="0"/>
+          <w:numId w:val="4"/>
+        </w:numPr>
+        <w:spacing w:after="0" w:before="0" w:line="480" w:lineRule="auto"/>
+      </w:pPr>
+      <w:r>
+        <w:rPr>
+          <w:rFonts w:ascii="Times New Roman" w:cs="Times New Roman" w:eastAsia="Times New Roman" w:hAnsi="Times New Roman"/>
+          <w:color w:val="000000"/>
+          <w:sz w:val="24"/>
+          <w:szCs w:val="24"/>
+        </w:rPr>
+        <w:t xml:space="preserve">Usuarios</w:t>
+      </w:r>
+    </w:p>
+    <w:p>
+      <w:pPr>
+        <w:pStyle w:val="ListParagraph"/>
+        <w:numPr>
+          <w:ilvl w:val="0"/>
+          <w:numId w:val="4"/>
+        </w:numPr>
+        <w:spacing w:after="0" w:before="0" w:line="480" w:lineRule="auto"/>
+      </w:pPr>
+      <w:r>
+        <w:rPr>
+          <w:rFonts w:ascii="Times New Roman" w:cs="Times New Roman" w:eastAsia="Times New Roman" w:hAnsi="Times New Roman"/>
+          <w:color w:val="000000"/>
+          <w:sz w:val="24"/>
+          <w:szCs w:val="24"/>
+        </w:rPr>
+        <w:t xml:space="preserve">Roles de usuario</w:t>
+      </w:r>
+    </w:p>
+    <w:p>
+      <w:pPr>
+        <w:pStyle w:val="ListParagraph"/>
+        <w:numPr>
+          <w:ilvl w:val="0"/>
+          <w:numId w:val="4"/>
+        </w:numPr>
+        <w:spacing w:after="0" w:before="0" w:line="480" w:lineRule="auto"/>
+      </w:pPr>
+      <w:r>
+        <w:rPr>
+          <w:rFonts w:ascii="Times New Roman" w:cs="Times New Roman" w:eastAsia="Times New Roman" w:hAnsi="Times New Roman"/>
+          <w:color w:val="000000"/>
+          <w:sz w:val="24"/>
+          <w:szCs w:val="24"/>
+        </w:rPr>
+        <w:t xml:space="preserve">Sesiones</w:t>
+      </w:r>
+    </w:p>
+    <w:p>
+      <w:pPr>
+        <w:pStyle w:val="ListParagraph"/>
+        <w:numPr>
+          <w:ilvl w:val="0"/>
+          <w:numId w:val="4"/>
+        </w:numPr>
+        <w:spacing w:after="0" w:before="0" w:line="480" w:lineRule="auto"/>
+      </w:pPr>
+      <w:r>
+        <w:rPr>
+          <w:rFonts w:ascii="Times New Roman" w:cs="Times New Roman" w:eastAsia="Times New Roman" w:hAnsi="Times New Roman"/>
+          <w:color w:val="000000"/>
+          <w:sz w:val="24"/>
+          <w:szCs w:val="24"/>
+        </w:rPr>
+        <w:t xml:space="preserve">Morosos y suministros</w:t>
+      </w:r>
+    </w:p>
+    <w:p>
+      <w:pPr>
+        <w:pStyle w:val="ListParagraph"/>
+        <w:numPr>
+          <w:ilvl w:val="0"/>
+          <w:numId w:val="4"/>
+        </w:numPr>
+        <w:spacing w:after="0" w:before="0" w:line="480" w:lineRule="auto"/>
+      </w:pPr>
+      <w:r>
+        <w:rPr>
+          <w:rFonts w:ascii="Times New Roman" w:cs="Times New Roman" w:eastAsia="Times New Roman" w:hAnsi="Times New Roman"/>
+          <w:color w:val="000000"/>
+          <w:sz w:val="24"/>
+          <w:szCs w:val="24"/>
+        </w:rPr>
+        <w:t xml:space="preserve">Órdenes de corte</w:t>
+      </w:r>
+    </w:p>
+    <w:p>
+      <w:pPr>
+        <w:pStyle w:val="ListParagraph"/>
+        <w:numPr>
+          <w:ilvl w:val="0"/>
+          <w:numId w:val="4"/>
+        </w:numPr>
+        <w:spacing w:after="0" w:before="0" w:line="480" w:lineRule="auto"/>
+      </w:pPr>
+      <w:r>
+        <w:rPr>
+          <w:rFonts w:ascii="Times New Roman" w:cs="Times New Roman" w:eastAsia="Times New Roman" w:hAnsi="Times New Roman"/>
+          <w:color w:val="000000"/>
+          <w:sz w:val="24"/>
+          <w:szCs w:val="24"/>
+        </w:rPr>
+        <w:t xml:space="preserve">Asignaciones de órdenes</w:t>
+      </w:r>
+    </w:p>
+    <w:p>
+      <w:pPr>
+        <w:pStyle w:val="ListParagraph"/>
+        <w:numPr>
+          <w:ilvl w:val="0"/>
+          <w:numId w:val="4"/>
+        </w:numPr>
+        <w:spacing w:after="0" w:before="0" w:line="480" w:lineRule="auto"/>
+      </w:pPr>
+      <w:r>
+        <w:rPr>
+          <w:rFonts w:ascii="Times New Roman" w:cs="Times New Roman" w:eastAsia="Times New Roman" w:hAnsi="Times New Roman"/>
+          <w:color w:val="000000"/>
+          <w:sz w:val="24"/>
+          <w:szCs w:val="24"/>
+        </w:rPr>
+        <w:t xml:space="preserve">Operaciones de comando</w:t>
+      </w:r>
+    </w:p>
+    <w:p>
+      <w:pPr>
+        <w:pStyle w:val="ListParagraph"/>
+        <w:numPr>
+          <w:ilvl w:val="0"/>
+          <w:numId w:val="4"/>
+        </w:numPr>
+        <w:spacing w:after="0" w:before="0" w:line="480" w:lineRule="auto"/>
+      </w:pPr>
+      <w:r>
+        <w:rPr>
+          <w:rFonts w:ascii="Times New Roman" w:cs="Times New Roman" w:eastAsia="Times New Roman" w:hAnsi="Times New Roman"/>
+          <w:color w:val="000000"/>
+          <w:sz w:val="24"/>
+          <w:szCs w:val="24"/>
+        </w:rPr>
+        <w:t xml:space="preserve">Autorizaciones de corte</w:t>
+      </w:r>
+    </w:p>
+    <w:p>
+      <w:pPr>
+        <w:pStyle w:val="ListParagraph"/>
+        <w:numPr>
+          <w:ilvl w:val="0"/>
+          <w:numId w:val="4"/>
+        </w:numPr>
+        <w:spacing w:after="0" w:before="0" w:line="480" w:lineRule="auto"/>
+      </w:pPr>
+      <w:r>
+        <w:rPr>
+          <w:rFonts w:ascii="Times New Roman" w:cs="Times New Roman" w:eastAsia="Times New Roman" w:hAnsi="Times New Roman"/>
+          <w:color w:val="000000"/>
+          <w:sz w:val="24"/>
+          <w:szCs w:val="24"/>
+        </w:rPr>
+        <w:t xml:space="preserve">Operaciones de sincronización</w:t>
+      </w:r>
+    </w:p>
+    <w:p>
+      <w:pPr>
+        <w:pStyle w:val="ListParagraph"/>
+        <w:numPr>
+          <w:ilvl w:val="0"/>
+          <w:numId w:val="4"/>
+        </w:numPr>
+        <w:spacing w:after="0" w:before="0" w:line="480" w:lineRule="auto"/>
+      </w:pPr>
+      <w:r>
+        <w:rPr>
+          <w:rFonts w:ascii="Times New Roman" w:cs="Times New Roman" w:eastAsia="Times New Roman" w:hAnsi="Times New Roman"/>
+          <w:color w:val="000000"/>
+          <w:sz w:val="24"/>
+          <w:szCs w:val="24"/>
+        </w:rPr>
+        <w:t xml:space="preserve">Evidencias fotográficas</w:t>
+      </w:r>
+    </w:p>
+    <w:p>
+      <w:pPr>
+        <w:pStyle w:val="ListParagraph"/>
+        <w:numPr>
+          <w:ilvl w:val="0"/>
+          <w:numId w:val="4"/>
+        </w:numPr>
+        <w:spacing w:after="0" w:before="0" w:line="480" w:lineRule="auto"/>
+      </w:pPr>
+      <w:r>
+        <w:rPr>
+          <w:rFonts w:ascii="Times New Roman" w:cs="Times New Roman" w:eastAsia="Times New Roman" w:hAnsi="Times New Roman"/>
+          <w:color w:val="000000"/>
+          <w:sz w:val="24"/>
+          <w:szCs w:val="24"/>
+        </w:rPr>
+        <w:t xml:space="preserve">Versiones del paquete de trabajo</w:t>
+      </w:r>
+    </w:p>
+    <w:p>
+      <w:pPr>
+        <w:pStyle w:val="ListParagraph"/>
+        <w:numPr>
+          <w:ilvl w:val="0"/>
+          <w:numId w:val="4"/>
+        </w:numPr>
+        <w:spacing w:after="0" w:before="0" w:line="480" w:lineRule="auto"/>
+      </w:pPr>
+      <w:r>
+        <w:rPr>
+          <w:rFonts w:ascii="Times New Roman" w:cs="Times New Roman" w:eastAsia="Times New Roman" w:hAnsi="Times New Roman"/>
+          <w:color w:val="000000"/>
+          <w:sz w:val="24"/>
+          <w:szCs w:val="24"/>
+        </w:rPr>
+        <w:t xml:space="preserve">Eventos de auditoría</w:t>
+      </w:r>
+    </w:p>
+    <w:p>
+      <w:pPr>
+        <w:pStyle w:val="ListParagraph"/>
+        <w:numPr>
+          <w:ilvl w:val="0"/>
+          <w:numId w:val="4"/>
+        </w:numPr>
+        <w:spacing w:after="0" w:before="0" w:line="480" w:lineRule="auto"/>
+      </w:pPr>
+      <w:r>
+        <w:rPr>
+          <w:rFonts w:ascii="Times New Roman" w:cs="Times New Roman" w:eastAsia="Times New Roman" w:hAnsi="Times New Roman"/>
+          <w:color w:val="000000"/>
+          <w:sz w:val="24"/>
+          <w:szCs w:val="24"/>
+        </w:rPr>
+        <w:t xml:space="preserve">Observaciones de pago (legado, sin uso en el piloto)</w:t>
+      </w:r>
+    </w:p>
+    <w:p>
+      <w:pPr>
+        <w:pStyle w:val="Heading2"/>
+      </w:pPr>
+      <w:r>
+        <w:rPr>
+          <w:rFonts w:ascii="Times New Roman" w:cs="Times New Roman" w:eastAsia="Times New Roman" w:hAnsi="Times New Roman"/>
+          <w:b/>
+          <w:bCs/>
+          <w:color w:val="000000"/>
+          <w:sz w:val="24"/>
+          <w:szCs w:val="24"/>
+        </w:rPr>
         <w:t xml:space="preserve">Diccionario de Datos</w:t>
       </w:r>
     </w:p>
@@ -604,6 +867,13 @@
         <w:spacing w:after="0" w:before="0" w:line="480" w:lineRule="auto"/>
         <w:ind w:firstLine="720"/>
         <w:jc w:val="left"/>
+        <w:sectPr>
+          <w:headerReference w:type="default" r:id="rId6"/>
+          <w:pgSz w:w="12240" w:h="15840" w:orient="portrait"/>
+          <w:pgMar w:top="1440" w:right="1440" w:bottom="1440" w:left="1440" w:header="708" w:footer="708" w:gutter="0"/>
+          <w:pgNumType/>
+          <w:docGrid w:linePitch="360"/>
+        </w:sectPr>
       </w:pPr>
       <w:r>
         <w:rPr>
@@ -613,6 +883,91 @@
           <w:szCs w:val="24"/>
         </w:rPr>
         <w:t xml:space="preserve">El código se organiza en carpetas separadas para la aplicación, el servidor, las migraciones de la base de datos y la descripción de las rutas del servidor. En el servidor, la atención de solicitudes, las reglas de negocio y el acceso a la base están separados, de modo que las reglas no dependen de la pantalla. El servidor tiene 24 rutas, y su descripción coincide con el código.</w:t>
+      </w:r>
+    </w:p>
+    <w:p>
+      <w:pPr>
+        <w:spacing w:after="0" w:before="0" w:line="240"/>
+      </w:pPr>
+      <w:r>
+        <w:rPr>
+          <w:rFonts w:ascii="Times New Roman" w:cs="Times New Roman" w:eastAsia="Times New Roman" w:hAnsi="Times New Roman"/>
+          <w:b/>
+          <w:bCs/>
+          <w:color w:val="000000"/>
+          <w:sz w:val="24"/>
+          <w:szCs w:val="24"/>
+        </w:rPr>
+        <w:t xml:space="preserve">Figura 1</w:t>
+      </w:r>
+    </w:p>
+    <w:p>
+      <w:pPr>
+        <w:spacing w:after="160" w:before="0" w:line="240"/>
+      </w:pPr>
+      <w:r>
+        <w:rPr>
+          <w:rFonts w:ascii="Times New Roman" w:cs="Times New Roman" w:eastAsia="Times New Roman" w:hAnsi="Times New Roman"/>
+          <w:i/>
+          <w:iCs/>
+          <w:color w:val="000000"/>
+          <w:sz w:val="24"/>
+          <w:szCs w:val="24"/>
+        </w:rPr>
+        <w:t xml:space="preserve">Modelo entidad-relación de la base de datos del piloto</w:t>
+      </w:r>
+    </w:p>
+    <w:p>
+      <w:pPr>
+        <w:spacing w:after="0" w:before="0" w:line="240"/>
+        <w:jc w:val="center"/>
+        <w:sectPr>
+          <w:headerReference w:type="default" r:id="rId7"/>
+          <w:pgSz w:w="15840" w:h="12240" w:orient="landscape"/>
+          <w:pgMar w:top="1080" w:right="1080" w:bottom="1080" w:left="1080" w:header="708" w:footer="708" w:gutter="0"/>
+          <w:pgNumType/>
+          <w:docGrid w:linePitch="360"/>
+        </w:sectPr>
+      </w:pPr>
+      <w:r>
+        <w:drawing>
+          <wp:inline distT="0" distB="0" distL="0" distR="0">
+            <wp:extent cx="8686800" cy="3600450"/>
+            <wp:effectExtent t="0" r="0" b="0" l="0"/>
+            <wp:docPr id="1" name="" descr="" title=""/>
+            <wp:cNvGraphicFramePr>
+              <a:graphicFrameLocks xmlns:a="http://schemas.openxmlformats.org/drawingml/2006/main" noChangeAspect="1"/>
+            </wp:cNvGraphicFramePr>
+            <a:graphic xmlns:a="http://schemas.openxmlformats.org/drawingml/2006/main">
+              <a:graphicData uri="http://schemas.openxmlformats.org/drawingml/2006/picture">
+                <pic:pic xmlns:pic="http://schemas.openxmlformats.org/drawingml/2006/picture">
+                  <pic:nvPicPr>
+                    <pic:cNvPr id="0" name="" descr=""/>
+                    <pic:cNvPicPr>
+                      <a:picLocks noChangeAspect="1" noChangeArrowheads="1"/>
+                    </pic:cNvPicPr>
+                  </pic:nvPicPr>
+                  <pic:blipFill>
+                    <a:blip r:embed="rId10" cstate="none"/>
+                    <a:srcRect/>
+                    <a:stretch>
+                      <a:fillRect/>
+                    </a:stretch>
+                  </pic:blipFill>
+                  <pic:spPr bwMode="auto">
+                    <a:xfrm>
+                      <a:off x="0" y="0"/>
+                      <a:ext cx="8686800" cy="3600450"/>
+                    </a:xfrm>
+                    <a:prstGeom prst="rect">
+                      <a:avLst/>
+                    </a:prstGeom>
+                  </pic:spPr>
+                </pic:pic>
+              </a:graphicData>
+            </a:graphic>
+          </wp:inline>
+        </w:drawing>
       </w:r>
     </w:p>
     <w:p>
@@ -746,6 +1101,676 @@
     </w:p>
     <w:p>
       <w:pPr>
+        <w:pStyle w:val="Heading2"/>
+      </w:pPr>
+      <w:r>
+        <w:rPr>
+          <w:rFonts w:ascii="Times New Roman" w:cs="Times New Roman" w:eastAsia="Times New Roman" w:hAnsi="Times New Roman"/>
+          <w:b/>
+          <w:bCs/>
+          <w:color w:val="000000"/>
+          <w:sz w:val="24"/>
+          <w:szCs w:val="24"/>
+        </w:rPr>
+        <w:t xml:space="preserve">Manual del Técnico de Campo: Paso a Paso</w:t>
+      </w:r>
+    </w:p>
+    <w:p>
+      <w:pPr>
+        <w:spacing w:after="0" w:before="0" w:line="480" w:lineRule="auto"/>
+        <w:ind w:firstLine="720"/>
+        <w:jc w:val="left"/>
+      </w:pPr>
+      <w:r>
+        <w:rPr>
+          <w:rFonts w:ascii="Times New Roman" w:cs="Times New Roman" w:eastAsia="Times New Roman" w:hAnsi="Times New Roman"/>
+          <w:color w:val="000000"/>
+          <w:sz w:val="24"/>
+          <w:szCs w:val="24"/>
+        </w:rPr>
+        <w:t xml:space="preserve">Este apartado describe cómo usa el técnico la aplicación en su teléfono. Las figuras 2 a 4 muestran las pantallas citadas.</w:t>
+      </w:r>
+    </w:p>
+    <w:p>
+      <w:pPr>
+        <w:keepNext/>
+        <w:spacing w:after="0" w:before="0" w:line="480" w:lineRule="auto"/>
+      </w:pPr>
+      <w:r>
+        <w:rPr>
+          <w:rFonts w:ascii="Times New Roman" w:cs="Times New Roman" w:eastAsia="Times New Roman" w:hAnsi="Times New Roman"/>
+          <w:b/>
+          <w:bCs/>
+          <w:color w:val="000000"/>
+          <w:sz w:val="24"/>
+          <w:szCs w:val="24"/>
+        </w:rPr>
+        <w:t xml:space="preserve">Antes de salir, con conexión a internet:</w:t>
+      </w:r>
+    </w:p>
+    <w:p>
+      <w:pPr>
+        <w:pStyle w:val="ListParagraph"/>
+        <w:numPr>
+          <w:ilvl w:val="0"/>
+          <w:numId w:val="5"/>
+        </w:numPr>
+        <w:spacing w:after="0" w:before="0" w:line="480" w:lineRule="auto"/>
+      </w:pPr>
+      <w:r>
+        <w:rPr>
+          <w:rFonts w:ascii="Times New Roman" w:cs="Times New Roman" w:eastAsia="Times New Roman" w:hAnsi="Times New Roman"/>
+          <w:color w:val="000000"/>
+          <w:sz w:val="24"/>
+          <w:szCs w:val="24"/>
+        </w:rPr>
+        <w:t xml:space="preserve">Abra SEPSA Campo y pulse Enviar pendientes y actualizar para descargar sus órdenes (Figura 2).</w:t>
+      </w:r>
+    </w:p>
+    <w:p>
+      <w:pPr>
+        <w:pStyle w:val="ListParagraph"/>
+        <w:numPr>
+          <w:ilvl w:val="0"/>
+          <w:numId w:val="5"/>
+        </w:numPr>
+        <w:spacing w:after="0" w:before="0" w:line="480" w:lineRule="auto"/>
+      </w:pPr>
+      <w:r>
+        <w:rPr>
+          <w:rFonts w:ascii="Times New Roman" w:cs="Times New Roman" w:eastAsia="Times New Roman" w:hAnsi="Times New Roman"/>
+          <w:color w:val="000000"/>
+          <w:sz w:val="24"/>
+          <w:szCs w:val="24"/>
+        </w:rPr>
+        <w:t xml:space="preserve">Revise que la parte superior de la pantalla diga Red disponible.</w:t>
+      </w:r>
+    </w:p>
+    <w:p>
+      <w:pPr>
+        <w:pStyle w:val="ListParagraph"/>
+        <w:numPr>
+          <w:ilvl w:val="0"/>
+          <w:numId w:val="5"/>
+        </w:numPr>
+        <w:spacing w:after="0" w:before="0" w:line="480" w:lineRule="auto"/>
+      </w:pPr>
+      <w:r>
+        <w:rPr>
+          <w:rFonts w:ascii="Times New Roman" w:cs="Times New Roman" w:eastAsia="Times New Roman" w:hAnsi="Times New Roman"/>
+          <w:color w:val="000000"/>
+          <w:sz w:val="24"/>
+          <w:szCs w:val="24"/>
+        </w:rPr>
+        <w:t xml:space="preserve">No borre los datos del navegador. Ahí están sus órdenes y las operaciones pendientes.</w:t>
+      </w:r>
+    </w:p>
+    <w:p>
+      <w:pPr>
+        <w:keepNext/>
+        <w:spacing w:after="0" w:before="0" w:line="480" w:lineRule="auto"/>
+      </w:pPr>
+      <w:r>
+        <w:rPr>
+          <w:rFonts w:ascii="Times New Roman" w:cs="Times New Roman" w:eastAsia="Times New Roman" w:hAnsi="Times New Roman"/>
+          <w:b/>
+          <w:bCs/>
+          <w:color w:val="000000"/>
+          <w:sz w:val="24"/>
+          <w:szCs w:val="24"/>
+        </w:rPr>
+        <w:t xml:space="preserve">En campo, para registrar un corte:</w:t>
+      </w:r>
+    </w:p>
+    <w:p>
+      <w:pPr>
+        <w:pStyle w:val="ListParagraph"/>
+        <w:numPr>
+          <w:ilvl w:val="0"/>
+          <w:numId w:val="6"/>
+        </w:numPr>
+        <w:spacing w:after="0" w:before="0" w:line="480" w:lineRule="auto"/>
+      </w:pPr>
+      <w:r>
+        <w:rPr>
+          <w:rFonts w:ascii="Times New Roman" w:cs="Times New Roman" w:eastAsia="Times New Roman" w:hAnsi="Times New Roman"/>
+          <w:color w:val="000000"/>
+          <w:sz w:val="24"/>
+          <w:szCs w:val="24"/>
+        </w:rPr>
+        <w:t xml:space="preserve">En la pantalla Jornada de campo, pulse Abrir orden. Revise el nombre, la dirección y la deuda.</w:t>
+      </w:r>
+    </w:p>
+    <w:p>
+      <w:pPr>
+        <w:pStyle w:val="ListParagraph"/>
+        <w:numPr>
+          <w:ilvl w:val="0"/>
+          <w:numId w:val="6"/>
+        </w:numPr>
+        <w:spacing w:after="0" w:before="0" w:line="480" w:lineRule="auto"/>
+      </w:pPr>
+      <w:r>
+        <w:rPr>
+          <w:rFonts w:ascii="Times New Roman" w:cs="Times New Roman" w:eastAsia="Times New Roman" w:hAnsi="Times New Roman"/>
+          <w:color w:val="000000"/>
+          <w:sz w:val="24"/>
+          <w:szCs w:val="24"/>
+        </w:rPr>
+        <w:t xml:space="preserve">Pulse Registrar corte (Figura 3).</w:t>
+      </w:r>
+    </w:p>
+    <w:p>
+      <w:pPr>
+        <w:pStyle w:val="ListParagraph"/>
+        <w:numPr>
+          <w:ilvl w:val="0"/>
+          <w:numId w:val="6"/>
+        </w:numPr>
+        <w:spacing w:after="0" w:before="0" w:line="480" w:lineRule="auto"/>
+      </w:pPr>
+      <w:r>
+        <w:rPr>
+          <w:rFonts w:ascii="Times New Roman" w:cs="Times New Roman" w:eastAsia="Times New Roman" w:hAnsi="Times New Roman"/>
+          <w:color w:val="000000"/>
+          <w:sz w:val="24"/>
+          <w:szCs w:val="24"/>
+        </w:rPr>
+        <w:t xml:space="preserve">Escriba la lectura final del medidor, en kWh. Debe ser un número no negativo y corresponder al medidor correcto.</w:t>
+      </w:r>
+    </w:p>
+    <w:p>
+      <w:pPr>
+        <w:pStyle w:val="ListParagraph"/>
+        <w:numPr>
+          <w:ilvl w:val="0"/>
+          <w:numId w:val="6"/>
+        </w:numPr>
+        <w:spacing w:after="0" w:before="0" w:line="480" w:lineRule="auto"/>
+      </w:pPr>
+      <w:r>
+        <w:rPr>
+          <w:rFonts w:ascii="Times New Roman" w:cs="Times New Roman" w:eastAsia="Times New Roman" w:hAnsi="Times New Roman"/>
+          <w:color w:val="000000"/>
+          <w:sz w:val="24"/>
+          <w:szCs w:val="24"/>
+        </w:rPr>
+        <w:t xml:space="preserve">Obtenga la ubicación GPS. Si no se obtiene, escriba el motivo.</w:t>
+      </w:r>
+    </w:p>
+    <w:p>
+      <w:pPr>
+        <w:pStyle w:val="ListParagraph"/>
+        <w:numPr>
+          <w:ilvl w:val="0"/>
+          <w:numId w:val="6"/>
+        </w:numPr>
+        <w:spacing w:after="0" w:before="0" w:line="480" w:lineRule="auto"/>
+      </w:pPr>
+      <w:r>
+        <w:rPr>
+          <w:rFonts w:ascii="Times New Roman" w:cs="Times New Roman" w:eastAsia="Times New Roman" w:hAnsi="Times New Roman"/>
+          <w:color w:val="000000"/>
+          <w:sz w:val="24"/>
+          <w:szCs w:val="24"/>
+        </w:rPr>
+        <w:t xml:space="preserve">Tome la fotografía en JPEG o PNG. Si no es posible, escriba la justificación obligatoria (Figura 4).</w:t>
+      </w:r>
+    </w:p>
+    <w:p>
+      <w:pPr>
+        <w:pStyle w:val="ListParagraph"/>
+        <w:numPr>
+          <w:ilvl w:val="0"/>
+          <w:numId w:val="6"/>
+        </w:numPr>
+        <w:spacing w:after="0" w:before="0" w:line="480" w:lineRule="auto"/>
+      </w:pPr>
+      <w:r>
+        <w:rPr>
+          <w:rFonts w:ascii="Times New Roman" w:cs="Times New Roman" w:eastAsia="Times New Roman" w:hAnsi="Times New Roman"/>
+          <w:color w:val="000000"/>
+          <w:sz w:val="24"/>
+          <w:szCs w:val="24"/>
+        </w:rPr>
+        <w:t xml:space="preserve">Espere la autorización en línea. La aplicación solo permite cortar si el servidor la confirma.</w:t>
+      </w:r>
+    </w:p>
+    <w:p>
+      <w:pPr>
+        <w:pStyle w:val="ListParagraph"/>
+        <w:numPr>
+          <w:ilvl w:val="0"/>
+          <w:numId w:val="6"/>
+        </w:numPr>
+        <w:spacing w:after="0" w:before="0" w:line="480" w:lineRule="auto"/>
+      </w:pPr>
+      <w:r>
+        <w:rPr>
+          <w:rFonts w:ascii="Times New Roman" w:cs="Times New Roman" w:eastAsia="Times New Roman" w:hAnsi="Times New Roman"/>
+          <w:color w:val="000000"/>
+          <w:sz w:val="24"/>
+          <w:szCs w:val="24"/>
+        </w:rPr>
+        <w:t xml:space="preserve">Confirme el corte. La operación queda como Pendiente hasta que el servidor la confirme; después aparece como Sincronizado.</w:t>
+      </w:r>
+    </w:p>
+    <w:p>
+      <w:pPr>
+        <w:keepNext/>
+        <w:spacing w:after="0" w:before="0" w:line="480" w:lineRule="auto"/>
+      </w:pPr>
+      <w:r>
+        <w:rPr>
+          <w:rFonts w:ascii="Times New Roman" w:cs="Times New Roman" w:eastAsia="Times New Roman" w:hAnsi="Times New Roman"/>
+          <w:b/>
+          <w:bCs/>
+          <w:color w:val="000000"/>
+          <w:sz w:val="24"/>
+          <w:szCs w:val="24"/>
+        </w:rPr>
+        <w:t xml:space="preserve">Si no puede cortar:</w:t>
+      </w:r>
+    </w:p>
+    <w:p>
+      <w:pPr>
+        <w:pStyle w:val="ListParagraph"/>
+        <w:numPr>
+          <w:ilvl w:val="0"/>
+          <w:numId w:val="7"/>
+        </w:numPr>
+        <w:spacing w:after="0" w:before="0" w:line="480" w:lineRule="auto"/>
+      </w:pPr>
+      <w:r>
+        <w:rPr>
+          <w:rFonts w:ascii="Times New Roman" w:cs="Times New Roman" w:eastAsia="Times New Roman" w:hAnsi="Times New Roman"/>
+          <w:color w:val="000000"/>
+          <w:sz w:val="24"/>
+          <w:szCs w:val="24"/>
+        </w:rPr>
+        <w:t xml:space="preserve">Pulse Registrar visita. Esto registra su presencia y no afirma que hubo corte. Si la autorización fue rechazada o no es clara, no se corta.</w:t>
+      </w:r>
+    </w:p>
+    <w:p>
+      <w:pPr>
+        <w:keepNext/>
+        <w:spacing w:after="0" w:before="0" w:line="480" w:lineRule="auto"/>
+      </w:pPr>
+      <w:r>
+        <w:rPr>
+          <w:rFonts w:ascii="Times New Roman" w:cs="Times New Roman" w:eastAsia="Times New Roman" w:hAnsi="Times New Roman"/>
+          <w:b/>
+          <w:bCs/>
+          <w:color w:val="000000"/>
+          <w:sz w:val="24"/>
+          <w:szCs w:val="24"/>
+        </w:rPr>
+        <w:t xml:space="preserve">Si una operación queda en revisión:</w:t>
+      </w:r>
+    </w:p>
+    <w:p>
+      <w:pPr>
+        <w:pStyle w:val="ListParagraph"/>
+        <w:numPr>
+          <w:ilvl w:val="0"/>
+          <w:numId w:val="8"/>
+        </w:numPr>
+        <w:spacing w:after="0" w:before="0" w:line="480" w:lineRule="auto"/>
+      </w:pPr>
+      <w:r>
+        <w:rPr>
+          <w:rFonts w:ascii="Times New Roman" w:cs="Times New Roman" w:eastAsia="Times New Roman" w:hAnsi="Times New Roman"/>
+          <w:color w:val="000000"/>
+          <w:sz w:val="24"/>
+          <w:szCs w:val="24"/>
+        </w:rPr>
+        <w:t xml:space="preserve">Pulse Verificar con servidor. La aplicación vuelve a consultar la autorización con el mismo identificador.</w:t>
+      </w:r>
+    </w:p>
+    <w:p>
+      <w:pPr>
+        <w:pStyle w:val="ListParagraph"/>
+        <w:numPr>
+          <w:ilvl w:val="0"/>
+          <w:numId w:val="8"/>
+        </w:numPr>
+        <w:spacing w:after="0" w:before="0" w:line="480" w:lineRule="auto"/>
+      </w:pPr>
+      <w:r>
+        <w:rPr>
+          <w:rFonts w:ascii="Times New Roman" w:cs="Times New Roman" w:eastAsia="Times New Roman" w:hAnsi="Times New Roman"/>
+          <w:color w:val="000000"/>
+          <w:sz w:val="24"/>
+          <w:szCs w:val="24"/>
+        </w:rPr>
+        <w:t xml:space="preserve">No repita la acción en campo mientras la respuesta no sea concluyente. Si la operación dice Revisión humana · no reenviar, avise al administrador.</w:t>
+      </w:r>
+    </w:p>
+    <w:p>
+      <w:pPr>
+        <w:keepNext/>
+        <w:spacing w:after="0" w:before="0" w:line="480" w:lineRule="auto"/>
+      </w:pPr>
+      <w:r>
+        <w:rPr>
+          <w:rFonts w:ascii="Times New Roman" w:cs="Times New Roman" w:eastAsia="Times New Roman" w:hAnsi="Times New Roman"/>
+          <w:b/>
+          <w:bCs/>
+          <w:color w:val="000000"/>
+          <w:sz w:val="24"/>
+          <w:szCs w:val="24"/>
+        </w:rPr>
+        <w:t xml:space="preserve">Para consultar lo ya sincronizado desde otro teléfono:</w:t>
+      </w:r>
+    </w:p>
+    <w:p>
+      <w:pPr>
+        <w:pStyle w:val="ListParagraph"/>
+        <w:numPr>
+          <w:ilvl w:val="0"/>
+          <w:numId w:val="9"/>
+        </w:numPr>
+        <w:spacing w:after="0" w:before="0" w:line="480" w:lineRule="auto"/>
+      </w:pPr>
+      <w:r>
+        <w:rPr>
+          <w:rFonts w:ascii="Times New Roman" w:cs="Times New Roman" w:eastAsia="Times New Roman" w:hAnsi="Times New Roman"/>
+          <w:color w:val="000000"/>
+          <w:sz w:val="24"/>
+          <w:szCs w:val="24"/>
+        </w:rPr>
+        <w:t xml:space="preserve">Abra la orden y pulse Ver registro del servidor. Verá las visitas, cortes y reconexiones con su estado. Lo que todavía está solo en el teléfono aparece en Pendientes.</w:t>
+      </w:r>
+    </w:p>
+    <w:tbl>
+      <w:tblPr>
+        <w:tblW w:type="dxa" w:w="9360"/>
+        <w:tblBorders>
+          <w:top w:val="none" w:color="FFFFFF" w:sz="0"/>
+          <w:left w:val="none" w:color="FFFFFF" w:sz="0"/>
+          <w:bottom w:val="none" w:color="FFFFFF" w:sz="0"/>
+          <w:right w:val="none" w:color="FFFFFF" w:sz="0"/>
+          <w:insideH w:val="none" w:color="FFFFFF" w:sz="0"/>
+          <w:insideV w:val="none" w:color="FFFFFF" w:sz="0"/>
+        </w:tblBorders>
+      </w:tblPr>
+      <w:tblGrid>
+        <w:gridCol w:w="3120"/>
+        <w:gridCol w:w="3120"/>
+        <w:gridCol w:w="3120"/>
+      </w:tblGrid>
+      <w:tr>
+        <w:tc>
+          <w:tcPr>
+            <w:tcW w:type="dxa" w:w="3120"/>
+            <w:tcBorders>
+              <w:top w:val="none" w:color="FFFFFF" w:sz="0"/>
+              <w:left w:val="none" w:color="FFFFFF" w:sz="0"/>
+              <w:bottom w:val="none" w:color="FFFFFF" w:sz="0"/>
+              <w:right w:val="none" w:color="FFFFFF" w:sz="0"/>
+            </w:tcBorders>
+          </w:tcPr>
+          <w:p>
+            <w:pPr>
+              <w:spacing w:after="0" w:before="0" w:line="240"/>
+            </w:pPr>
+            <w:r>
+              <w:rPr>
+                <w:rFonts w:ascii="Times New Roman" w:cs="Times New Roman" w:eastAsia="Times New Roman" w:hAnsi="Times New Roman"/>
+                <w:b/>
+                <w:bCs/>
+                <w:color w:val="000000"/>
+                <w:sz w:val="24"/>
+                <w:szCs w:val="24"/>
+              </w:rPr>
+              <w:t xml:space="preserve">Figura 2</w:t>
+            </w:r>
+          </w:p>
+          <w:p>
+            <w:pPr>
+              <w:spacing w:after="160" w:before="0" w:line="240"/>
+            </w:pPr>
+            <w:r>
+              <w:rPr>
+                <w:rFonts w:ascii="Times New Roman" w:cs="Times New Roman" w:eastAsia="Times New Roman" w:hAnsi="Times New Roman"/>
+                <w:i/>
+                <w:iCs/>
+                <w:color w:val="000000"/>
+                <w:sz w:val="24"/>
+                <w:szCs w:val="24"/>
+              </w:rPr>
+              <w:t xml:space="preserve">Pantalla Jornada de campo</w:t>
+            </w:r>
+          </w:p>
+          <w:p>
+            <w:pPr>
+              <w:spacing w:after="0" w:before="0" w:line="240"/>
+              <w:jc w:val="center"/>
+            </w:pPr>
+            <w:r>
+              <w:drawing>
+                <wp:inline distT="0" distB="0" distL="0" distR="0">
+                  <wp:extent cx="1714500" cy="3714750"/>
+                  <wp:effectExtent t="0" r="0" b="0" l="0"/>
+                  <wp:docPr id="2" name="" descr="" title=""/>
+                  <wp:cNvGraphicFramePr>
+                    <a:graphicFrameLocks xmlns:a="http://schemas.openxmlformats.org/drawingml/2006/main" noChangeAspect="1"/>
+                  </wp:cNvGraphicFramePr>
+                  <a:graphic xmlns:a="http://schemas.openxmlformats.org/drawingml/2006/main">
+                    <a:graphicData uri="http://schemas.openxmlformats.org/drawingml/2006/picture">
+                      <pic:pic xmlns:pic="http://schemas.openxmlformats.org/drawingml/2006/picture">
+                        <pic:nvPicPr>
+                          <pic:cNvPr id="0" name="" descr=""/>
+                          <pic:cNvPicPr>
+                            <a:picLocks noChangeAspect="1" noChangeArrowheads="1"/>
+                          </pic:cNvPicPr>
+                        </pic:nvPicPr>
+                        <pic:blipFill>
+                          <a:blip r:embed="rId11" cstate="none"/>
+                          <a:srcRect/>
+                          <a:stretch>
+                            <a:fillRect/>
+                          </a:stretch>
+                        </pic:blipFill>
+                        <pic:spPr bwMode="auto">
+                          <a:xfrm>
+                            <a:off x="0" y="0"/>
+                            <a:ext cx="1714500" cy="3714750"/>
+                          </a:xfrm>
+                          <a:prstGeom prst="rect">
+                            <a:avLst/>
+                          </a:prstGeom>
+                        </pic:spPr>
+                      </pic:pic>
+                    </a:graphicData>
+                  </a:graphic>
+                </wp:inline>
+              </w:drawing>
+            </w:r>
+          </w:p>
+        </w:tc>
+        <w:tc>
+          <w:tcPr>
+            <w:tcW w:type="dxa" w:w="3120"/>
+            <w:tcBorders>
+              <w:top w:val="none" w:color="FFFFFF" w:sz="0"/>
+              <w:left w:val="none" w:color="FFFFFF" w:sz="0"/>
+              <w:bottom w:val="none" w:color="FFFFFF" w:sz="0"/>
+              <w:right w:val="none" w:color="FFFFFF" w:sz="0"/>
+            </w:tcBorders>
+          </w:tcPr>
+          <w:p>
+            <w:pPr>
+              <w:spacing w:after="0" w:before="0" w:line="240"/>
+            </w:pPr>
+            <w:r>
+              <w:rPr>
+                <w:rFonts w:ascii="Times New Roman" w:cs="Times New Roman" w:eastAsia="Times New Roman" w:hAnsi="Times New Roman"/>
+                <w:b/>
+                <w:bCs/>
+                <w:color w:val="000000"/>
+                <w:sz w:val="24"/>
+                <w:szCs w:val="24"/>
+              </w:rPr>
+              <w:t xml:space="preserve">Figura 3</w:t>
+            </w:r>
+          </w:p>
+          <w:p>
+            <w:pPr>
+              <w:spacing w:after="160" w:before="0" w:line="240"/>
+            </w:pPr>
+            <w:r>
+              <w:rPr>
+                <w:rFonts w:ascii="Times New Roman" w:cs="Times New Roman" w:eastAsia="Times New Roman" w:hAnsi="Times New Roman"/>
+                <w:i/>
+                <w:iCs/>
+                <w:color w:val="000000"/>
+                <w:sz w:val="24"/>
+                <w:szCs w:val="24"/>
+              </w:rPr>
+              <w:t xml:space="preserve">Detalle de la orden con Registrar corte</w:t>
+            </w:r>
+          </w:p>
+          <w:p>
+            <w:pPr>
+              <w:spacing w:after="0" w:before="0" w:line="240"/>
+              <w:jc w:val="center"/>
+            </w:pPr>
+            <w:r>
+              <w:drawing>
+                <wp:inline distT="0" distB="0" distL="0" distR="0">
+                  <wp:extent cx="1714500" cy="3714750"/>
+                  <wp:effectExtent t="0" r="0" b="0" l="0"/>
+                  <wp:docPr id="3" name="" descr="" title=""/>
+                  <wp:cNvGraphicFramePr>
+                    <a:graphicFrameLocks xmlns:a="http://schemas.openxmlformats.org/drawingml/2006/main" noChangeAspect="1"/>
+                  </wp:cNvGraphicFramePr>
+                  <a:graphic xmlns:a="http://schemas.openxmlformats.org/drawingml/2006/main">
+                    <a:graphicData uri="http://schemas.openxmlformats.org/drawingml/2006/picture">
+                      <pic:pic xmlns:pic="http://schemas.openxmlformats.org/drawingml/2006/picture">
+                        <pic:nvPicPr>
+                          <pic:cNvPr id="0" name="" descr=""/>
+                          <pic:cNvPicPr>
+                            <a:picLocks noChangeAspect="1" noChangeArrowheads="1"/>
+                          </pic:cNvPicPr>
+                        </pic:nvPicPr>
+                        <pic:blipFill>
+                          <a:blip r:embed="rId12" cstate="none"/>
+                          <a:srcRect/>
+                          <a:stretch>
+                            <a:fillRect/>
+                          </a:stretch>
+                        </pic:blipFill>
+                        <pic:spPr bwMode="auto">
+                          <a:xfrm>
+                            <a:off x="0" y="0"/>
+                            <a:ext cx="1714500" cy="3714750"/>
+                          </a:xfrm>
+                          <a:prstGeom prst="rect">
+                            <a:avLst/>
+                          </a:prstGeom>
+                        </pic:spPr>
+                      </pic:pic>
+                    </a:graphicData>
+                  </a:graphic>
+                </wp:inline>
+              </w:drawing>
+            </w:r>
+          </w:p>
+        </w:tc>
+        <w:tc>
+          <w:tcPr>
+            <w:tcW w:type="dxa" w:w="3120"/>
+            <w:tcBorders>
+              <w:top w:val="none" w:color="FFFFFF" w:sz="0"/>
+              <w:left w:val="none" w:color="FFFFFF" w:sz="0"/>
+              <w:bottom w:val="none" w:color="FFFFFF" w:sz="0"/>
+              <w:right w:val="none" w:color="FFFFFF" w:sz="0"/>
+            </w:tcBorders>
+          </w:tcPr>
+          <w:p>
+            <w:pPr>
+              <w:spacing w:after="0" w:before="0" w:line="240"/>
+            </w:pPr>
+            <w:r>
+              <w:rPr>
+                <w:rFonts w:ascii="Times New Roman" w:cs="Times New Roman" w:eastAsia="Times New Roman" w:hAnsi="Times New Roman"/>
+                <w:b/>
+                <w:bCs/>
+                <w:color w:val="000000"/>
+                <w:sz w:val="24"/>
+                <w:szCs w:val="24"/>
+              </w:rPr>
+              <w:t xml:space="preserve">Figura 4</w:t>
+            </w:r>
+          </w:p>
+          <w:p>
+            <w:pPr>
+              <w:spacing w:after="160" w:before="0" w:line="240"/>
+            </w:pPr>
+            <w:r>
+              <w:rPr>
+                <w:rFonts w:ascii="Times New Roman" w:cs="Times New Roman" w:eastAsia="Times New Roman" w:hAnsi="Times New Roman"/>
+                <w:i/>
+                <w:iCs/>
+                <w:color w:val="000000"/>
+                <w:sz w:val="24"/>
+                <w:szCs w:val="24"/>
+              </w:rPr>
+              <w:t xml:space="preserve">Excepción de foto con justificación obligatoria</w:t>
+            </w:r>
+          </w:p>
+          <w:p>
+            <w:pPr>
+              <w:spacing w:after="0" w:before="0" w:line="240"/>
+              <w:jc w:val="center"/>
+            </w:pPr>
+            <w:r>
+              <w:drawing>
+                <wp:inline distT="0" distB="0" distL="0" distR="0">
+                  <wp:extent cx="1714500" cy="1581150"/>
+                  <wp:effectExtent t="0" r="0" b="0" l="0"/>
+                  <wp:docPr id="4" name="" descr="" title=""/>
+                  <wp:cNvGraphicFramePr>
+                    <a:graphicFrameLocks xmlns:a="http://schemas.openxmlformats.org/drawingml/2006/main" noChangeAspect="1"/>
+                  </wp:cNvGraphicFramePr>
+                  <a:graphic xmlns:a="http://schemas.openxmlformats.org/drawingml/2006/main">
+                    <a:graphicData uri="http://schemas.openxmlformats.org/drawingml/2006/picture">
+                      <pic:pic xmlns:pic="http://schemas.openxmlformats.org/drawingml/2006/picture">
+                        <pic:nvPicPr>
+                          <pic:cNvPr id="0" name="" descr=""/>
+                          <pic:cNvPicPr>
+                            <a:picLocks noChangeAspect="1" noChangeArrowheads="1"/>
+                          </pic:cNvPicPr>
+                        </pic:nvPicPr>
+                        <pic:blipFill>
+                          <a:blip r:embed="rId13" cstate="none"/>
+                          <a:srcRect/>
+                          <a:stretch>
+                            <a:fillRect/>
+                          </a:stretch>
+                        </pic:blipFill>
+                        <pic:spPr bwMode="auto">
+                          <a:xfrm>
+                            <a:off x="0" y="0"/>
+                            <a:ext cx="1714500" cy="1581150"/>
+                          </a:xfrm>
+                          <a:prstGeom prst="rect">
+                            <a:avLst/>
+                          </a:prstGeom>
+                        </pic:spPr>
+                      </pic:pic>
+                    </a:graphicData>
+                  </a:graphic>
+                </wp:inline>
+              </w:drawing>
+            </w:r>
+          </w:p>
+        </w:tc>
+      </w:tr>
+    </w:tbl>
+    <w:p>
+      <w:pPr>
         <w:pStyle w:val="Heading1"/>
         <w:pageBreakBefore/>
       </w:pPr>
@@ -1410,7 +2435,7 @@
       </w:r>
     </w:p>
     <w:sectPr>
-      <w:headerReference w:type="default" r:id="rId6"/>
+      <w:headerReference w:type="default" r:id="rId8"/>
       <w:pgSz w:w="12240" w:h="15840" w:orient="portrait"/>
       <w:pgMar w:top="1440" w:right="1440" w:bottom="1440" w:left="1440" w:header="708" w:footer="708" w:gutter="0"/>
       <w:pgNumType/>
@@ -1495,6 +2520,50 @@
 </file>
 
 <file path=word/header1.xml><?xml version="1.0" encoding="utf-8"?>
+<w:hdr xmlns:wpc="http://schemas.microsoft.com/office/word/2010/wordprocessingCanvas" xmlns:mc="http://schemas.openxmlformats.org/markup-compatibility/2006" xmlns:o="urn:schemas-microsoft-com:office:office" xmlns:r="http://schemas.openxmlformats.org/officeDocument/2006/relationships" xmlns:m="http://schemas.openxmlformats.org/officeDocument/2006/math" xmlns:v="urn:schemas-microsoft-com:vml" xmlns:wp14="http://schemas.microsoft.com/office/word/2010/wordprocessingDrawing" xmlns:wp="http://schemas.openxmlformats.org/drawingml/2006/wordprocessingDrawing" xmlns:w10="urn:schemas-microsoft-com:office:word" xmlns:w="http://schemas.openxmlformats.org/wordprocessingml/2006/main" xmlns:w14="http://schemas.microsoft.com/office/word/2010/wordml" xmlns:w15="http://schemas.microsoft.com/office/word/2012/wordml" xmlns:wpg="http://schemas.microsoft.com/office/word/2010/wordprocessingGroup" xmlns:wpi="http://schemas.microsoft.com/office/word/2010/wordprocessingInk" xmlns:wne="http://schemas.microsoft.com/office/word/2006/wordml" xmlns:wps="http://schemas.microsoft.com/office/word/2010/wordprocessingShape" xmlns:cx="http://schemas.microsoft.com/office/drawing/2014/chartex" xmlns:cx1="http://schemas.microsoft.com/office/drawing/2015/9/8/chartex" xmlns:cx2="http://schemas.microsoft.com/office/drawing/2015/10/21/chartex" xmlns:cx3="http://schemas.microsoft.com/office/drawing/2016/5/9/chartex" xmlns:cx4="http://schemas.microsoft.com/office/drawing/2016/5/10/chartex" xmlns:cx5="http://schemas.microsoft.com/office/drawing/2016/5/11/chartex" xmlns:cx6="http://schemas.microsoft.com/office/drawing/2016/5/12/chartex" xmlns:cx7="http://schemas.microsoft.com/office/drawing/2016/5/13/chartex" xmlns:cx8="http://schemas.microsoft.com/office/drawing/2016/5/14/chartex" xmlns:w16cid="http://schemas.microsoft.com/office/word/2016/wordml/cid" xmlns:w16se="http://schemas.microsoft.com/office/word/2015/wordml/symex">
+  <w:p>
+    <w:pPr>
+      <w:jc w:val="right"/>
+    </w:pPr>
+    <w:r>
+      <w:rPr>
+        <w:rFonts w:ascii="Times New Roman" w:cs="Times New Roman" w:eastAsia="Times New Roman" w:hAnsi="Times New Roman"/>
+        <w:color w:val="000000"/>
+        <w:sz w:val="24"/>
+        <w:szCs w:val="24"/>
+      </w:rPr>
+      <w:fldChar w:fldCharType="begin"/>
+      <w:instrText xml:space="preserve">PAGE</w:instrText>
+      <w:fldChar w:fldCharType="separate"/>
+      <w:fldChar w:fldCharType="end"/>
+    </w:r>
+  </w:p>
+</w:hdr>
+</file>
+
+<file path=word/header2.xml><?xml version="1.0" encoding="utf-8"?>
+<w:hdr xmlns:wpc="http://schemas.microsoft.com/office/word/2010/wordprocessingCanvas" xmlns:mc="http://schemas.openxmlformats.org/markup-compatibility/2006" xmlns:o="urn:schemas-microsoft-com:office:office" xmlns:r="http://schemas.openxmlformats.org/officeDocument/2006/relationships" xmlns:m="http://schemas.openxmlformats.org/officeDocument/2006/math" xmlns:v="urn:schemas-microsoft-com:vml" xmlns:wp14="http://schemas.microsoft.com/office/word/2010/wordprocessingDrawing" xmlns:wp="http://schemas.openxmlformats.org/drawingml/2006/wordprocessingDrawing" xmlns:w10="urn:schemas-microsoft-com:office:word" xmlns:w="http://schemas.openxmlformats.org/wordprocessingml/2006/main" xmlns:w14="http://schemas.microsoft.com/office/word/2010/wordml" xmlns:w15="http://schemas.microsoft.com/office/word/2012/wordml" xmlns:wpg="http://schemas.microsoft.com/office/word/2010/wordprocessingGroup" xmlns:wpi="http://schemas.microsoft.com/office/word/2010/wordprocessingInk" xmlns:wne="http://schemas.microsoft.com/office/word/2006/wordml" xmlns:wps="http://schemas.microsoft.com/office/word/2010/wordprocessingShape" xmlns:cx="http://schemas.microsoft.com/office/drawing/2014/chartex" xmlns:cx1="http://schemas.microsoft.com/office/drawing/2015/9/8/chartex" xmlns:cx2="http://schemas.microsoft.com/office/drawing/2015/10/21/chartex" xmlns:cx3="http://schemas.microsoft.com/office/drawing/2016/5/9/chartex" xmlns:cx4="http://schemas.microsoft.com/office/drawing/2016/5/10/chartex" xmlns:cx5="http://schemas.microsoft.com/office/drawing/2016/5/11/chartex" xmlns:cx6="http://schemas.microsoft.com/office/drawing/2016/5/12/chartex" xmlns:cx7="http://schemas.microsoft.com/office/drawing/2016/5/13/chartex" xmlns:cx8="http://schemas.microsoft.com/office/drawing/2016/5/14/chartex" xmlns:w16cid="http://schemas.microsoft.com/office/word/2016/wordml/cid" xmlns:w16se="http://schemas.microsoft.com/office/word/2015/wordml/symex">
+  <w:p>
+    <w:pPr>
+      <w:jc w:val="right"/>
+    </w:pPr>
+    <w:r>
+      <w:rPr>
+        <w:rFonts w:ascii="Times New Roman" w:cs="Times New Roman" w:eastAsia="Times New Roman" w:hAnsi="Times New Roman"/>
+        <w:color w:val="000000"/>
+        <w:sz w:val="24"/>
+        <w:szCs w:val="24"/>
+      </w:rPr>
+      <w:fldChar w:fldCharType="begin"/>
+      <w:instrText xml:space="preserve">PAGE</w:instrText>
+      <w:fldChar w:fldCharType="separate"/>
+      <w:fldChar w:fldCharType="end"/>
+    </w:r>
+  </w:p>
+</w:hdr>
+</file>
+
+<file path=word/header3.xml><?xml version="1.0" encoding="utf-8"?>
 <w:hdr xmlns:wpc="http://schemas.microsoft.com/office/word/2010/wordprocessingCanvas" xmlns:mc="http://schemas.openxmlformats.org/markup-compatibility/2006" xmlns:o="urn:schemas-microsoft-com:office:office" xmlns:r="http://schemas.openxmlformats.org/officeDocument/2006/relationships" xmlns:m="http://schemas.openxmlformats.org/officeDocument/2006/math" xmlns:v="urn:schemas-microsoft-com:vml" xmlns:wp14="http://schemas.microsoft.com/office/word/2010/wordprocessingDrawing" xmlns:wp="http://schemas.openxmlformats.org/drawingml/2006/wordprocessingDrawing" xmlns:w10="urn:schemas-microsoft-com:office:word" xmlns:w="http://schemas.openxmlformats.org/wordprocessingml/2006/main" xmlns:w14="http://schemas.microsoft.com/office/word/2010/wordml" xmlns:w15="http://schemas.microsoft.com/office/word/2012/wordml" xmlns:wpg="http://schemas.microsoft.com/office/word/2010/wordprocessingGroup" xmlns:wpi="http://schemas.microsoft.com/office/word/2010/wordprocessingInk" xmlns:wne="http://schemas.microsoft.com/office/word/2006/wordml" xmlns:wps="http://schemas.microsoft.com/office/word/2010/wordprocessingShape" xmlns:cx="http://schemas.microsoft.com/office/drawing/2014/chartex" xmlns:cx1="http://schemas.microsoft.com/office/drawing/2015/9/8/chartex" xmlns:cx2="http://schemas.microsoft.com/office/drawing/2015/10/21/chartex" xmlns:cx3="http://schemas.microsoft.com/office/drawing/2016/5/9/chartex" xmlns:cx4="http://schemas.microsoft.com/office/drawing/2016/5/10/chartex" xmlns:cx5="http://schemas.microsoft.com/office/drawing/2016/5/11/chartex" xmlns:cx6="http://schemas.microsoft.com/office/drawing/2016/5/12/chartex" xmlns:cx7="http://schemas.microsoft.com/office/drawing/2016/5/13/chartex" xmlns:cx8="http://schemas.microsoft.com/office/drawing/2016/5/14/chartex" xmlns:w16cid="http://schemas.microsoft.com/office/word/2016/wordml/cid" xmlns:w16se="http://schemas.microsoft.com/office/word/2015/wordml/symex">
   <w:p>
     <w:pPr>
@@ -1606,8 +2675,8 @@
     <w:multiLevelType w:val="hybridMultilevel"/>
     <w:lvl w:ilvl="0" w:tentative="1">
       <w:start w:val="1"/>
-      <w:numFmt w:val="bullet"/>
-      <w:lvlText w:val="•"/>
+      <w:numFmt w:val="decimal"/>
+      <w:lvlText w:val="%1."/>
       <w:lvlJc w:val="left"/>
       <w:pPr>
         <w:ind w:left="720" w:hanging="360"/>
@@ -1626,6 +2695,78 @@
       </w:pPr>
     </w:lvl>
   </w:abstractNum>
+  <w:abstractNum w:abstractNumId="4" w15:restartNumberingAfterBreak="0">
+    <w:multiLevelType w:val="hybridMultilevel"/>
+    <w:lvl w:ilvl="0" w:tentative="1">
+      <w:start w:val="1"/>
+      <w:numFmt w:val="decimal"/>
+      <w:lvlText w:val="%1."/>
+      <w:lvlJc w:val="left"/>
+      <w:pPr>
+        <w:ind w:left="720" w:hanging="360"/>
+      </w:pPr>
+    </w:lvl>
+  </w:abstractNum>
+  <w:abstractNum w:abstractNumId="5" w15:restartNumberingAfterBreak="0">
+    <w:multiLevelType w:val="hybridMultilevel"/>
+    <w:lvl w:ilvl="0" w:tentative="1">
+      <w:start w:val="1"/>
+      <w:numFmt w:val="decimal"/>
+      <w:lvlText w:val="%1."/>
+      <w:lvlJc w:val="left"/>
+      <w:pPr>
+        <w:ind w:left="720" w:hanging="360"/>
+      </w:pPr>
+    </w:lvl>
+  </w:abstractNum>
+  <w:abstractNum w:abstractNumId="6" w15:restartNumberingAfterBreak="0">
+    <w:multiLevelType w:val="hybridMultilevel"/>
+    <w:lvl w:ilvl="0" w:tentative="1">
+      <w:start w:val="1"/>
+      <w:numFmt w:val="decimal"/>
+      <w:lvlText w:val="%1."/>
+      <w:lvlJc w:val="left"/>
+      <w:pPr>
+        <w:ind w:left="720" w:hanging="360"/>
+      </w:pPr>
+    </w:lvl>
+  </w:abstractNum>
+  <w:abstractNum w:abstractNumId="7" w15:restartNumberingAfterBreak="0">
+    <w:multiLevelType w:val="hybridMultilevel"/>
+    <w:lvl w:ilvl="0" w:tentative="1">
+      <w:start w:val="1"/>
+      <w:numFmt w:val="decimal"/>
+      <w:lvlText w:val="%1."/>
+      <w:lvlJc w:val="left"/>
+      <w:pPr>
+        <w:ind w:left="720" w:hanging="360"/>
+      </w:pPr>
+    </w:lvl>
+  </w:abstractNum>
+  <w:abstractNum w:abstractNumId="8" w15:restartNumberingAfterBreak="0">
+    <w:multiLevelType w:val="hybridMultilevel"/>
+    <w:lvl w:ilvl="0" w:tentative="1">
+      <w:start w:val="1"/>
+      <w:numFmt w:val="bullet"/>
+      <w:lvlText w:val="•"/>
+      <w:lvlJc w:val="left"/>
+      <w:pPr>
+        <w:ind w:left="720" w:hanging="360"/>
+      </w:pPr>
+    </w:lvl>
+  </w:abstractNum>
+  <w:abstractNum w:abstractNumId="9" w15:restartNumberingAfterBreak="0">
+    <w:multiLevelType w:val="hybridMultilevel"/>
+    <w:lvl w:ilvl="0" w:tentative="1">
+      <w:start w:val="1"/>
+      <w:numFmt w:val="decimal"/>
+      <w:lvlText w:val="%1."/>
+      <w:lvlJc w:val="left"/>
+      <w:pPr>
+        <w:ind w:left="720" w:hanging="360"/>
+      </w:pPr>
+    </w:lvl>
+  </w:abstractNum>
   <w:num w:numId="1">
     <w:abstractNumId w:val="1"/>
     <w:lvlOverride w:ilvl="0">
@@ -1633,13 +2774,49 @@
     </w:lvlOverride>
   </w:num>
   <w:num w:numId="2">
+    <w:abstractNumId w:val="9"/>
+    <w:lvlOverride w:ilvl="0">
+      <w:startOverride w:val="1"/>
+    </w:lvlOverride>
+  </w:num>
+  <w:num w:numId="3">
+    <w:abstractNumId w:val="8"/>
+    <w:lvlOverride w:ilvl="0">
+      <w:startOverride w:val="1"/>
+    </w:lvlOverride>
+  </w:num>
+  <w:num w:numId="4">
+    <w:abstractNumId w:val="7"/>
+    <w:lvlOverride w:ilvl="0">
+      <w:startOverride w:val="1"/>
+    </w:lvlOverride>
+  </w:num>
+  <w:num w:numId="5">
+    <w:abstractNumId w:val="2"/>
+    <w:lvlOverride w:ilvl="0">
+      <w:startOverride w:val="1"/>
+    </w:lvlOverride>
+  </w:num>
+  <w:num w:numId="6">
     <w:abstractNumId w:val="3"/>
     <w:lvlOverride w:ilvl="0">
       <w:startOverride w:val="1"/>
     </w:lvlOverride>
   </w:num>
-  <w:num w:numId="3">
-    <w:abstractNumId w:val="2"/>
+  <w:num w:numId="7">
+    <w:abstractNumId w:val="4"/>
+    <w:lvlOverride w:ilvl="0">
+      <w:startOverride w:val="1"/>
+    </w:lvlOverride>
+  </w:num>
+  <w:num w:numId="8">
+    <w:abstractNumId w:val="5"/>
+    <w:lvlOverride w:ilvl="0">
+      <w:startOverride w:val="1"/>
+    </w:lvlOverride>
+  </w:num>
+  <w:num w:numId="9">
+    <w:abstractNumId w:val="6"/>
     <w:lvlOverride w:ilvl="0">
       <w:startOverride w:val="1"/>
     </w:lvlOverride>

</xml_diff>

<commit_message>
docs(entrega-sepsa): diccionario de datos y documentación del código en el punto 2
Reemplaza la lista de nombres de tablas por un diccionario en tabla con las 13 tablas en español, su función y sus campos principales. La documentación del código describe solo la estructura del proyecto y la responsabilidad de sus archivos principales, verificadas contra el repositorio. El punto 2 ocupa cuatro hojas, con aprobación explícita del responsable.
</commit_message>
<xml_diff>
--- a/docs/entrega-sepsa/entrega-oficial-SEPSA.docx
+++ b/docs/entrega-sepsa/entrega-oficial-SEPSA.docx
@@ -564,259 +564,28 @@
           <w:sz w:val="24"/>
           <w:szCs w:val="24"/>
         </w:rPr>
-        <w:t xml:space="preserve">Nombres de las Tablas</w:t>
-      </w:r>
-    </w:p>
-    <w:p>
-      <w:pPr>
-        <w:pStyle w:val="ListParagraph"/>
-        <w:numPr>
-          <w:ilvl w:val="0"/>
-          <w:numId w:val="4"/>
-        </w:numPr>
-        <w:spacing w:after="0" w:before="0" w:line="480" w:lineRule="auto"/>
-      </w:pPr>
-      <w:r>
-        <w:rPr>
-          <w:rFonts w:ascii="Times New Roman" w:cs="Times New Roman" w:eastAsia="Times New Roman" w:hAnsi="Times New Roman"/>
-          <w:color w:val="000000"/>
-          <w:sz w:val="24"/>
-          <w:szCs w:val="24"/>
-        </w:rPr>
-        <w:t xml:space="preserve">Usuarios</w:t>
-      </w:r>
-    </w:p>
-    <w:p>
-      <w:pPr>
-        <w:pStyle w:val="ListParagraph"/>
-        <w:numPr>
-          <w:ilvl w:val="0"/>
-          <w:numId w:val="4"/>
-        </w:numPr>
-        <w:spacing w:after="0" w:before="0" w:line="480" w:lineRule="auto"/>
-      </w:pPr>
-      <w:r>
-        <w:rPr>
-          <w:rFonts w:ascii="Times New Roman" w:cs="Times New Roman" w:eastAsia="Times New Roman" w:hAnsi="Times New Roman"/>
-          <w:color w:val="000000"/>
-          <w:sz w:val="24"/>
-          <w:szCs w:val="24"/>
-        </w:rPr>
-        <w:t xml:space="preserve">Roles de usuario</w:t>
-      </w:r>
-    </w:p>
-    <w:p>
-      <w:pPr>
-        <w:pStyle w:val="ListParagraph"/>
-        <w:numPr>
-          <w:ilvl w:val="0"/>
-          <w:numId w:val="4"/>
-        </w:numPr>
-        <w:spacing w:after="0" w:before="0" w:line="480" w:lineRule="auto"/>
-      </w:pPr>
-      <w:r>
-        <w:rPr>
-          <w:rFonts w:ascii="Times New Roman" w:cs="Times New Roman" w:eastAsia="Times New Roman" w:hAnsi="Times New Roman"/>
-          <w:color w:val="000000"/>
-          <w:sz w:val="24"/>
-          <w:szCs w:val="24"/>
-        </w:rPr>
-        <w:t xml:space="preserve">Sesiones</w:t>
-      </w:r>
-    </w:p>
-    <w:p>
-      <w:pPr>
-        <w:pStyle w:val="ListParagraph"/>
-        <w:numPr>
-          <w:ilvl w:val="0"/>
-          <w:numId w:val="4"/>
-        </w:numPr>
-        <w:spacing w:after="0" w:before="0" w:line="480" w:lineRule="auto"/>
-      </w:pPr>
-      <w:r>
-        <w:rPr>
-          <w:rFonts w:ascii="Times New Roman" w:cs="Times New Roman" w:eastAsia="Times New Roman" w:hAnsi="Times New Roman"/>
-          <w:color w:val="000000"/>
-          <w:sz w:val="24"/>
-          <w:szCs w:val="24"/>
-        </w:rPr>
-        <w:t xml:space="preserve">Morosos y suministros</w:t>
-      </w:r>
-    </w:p>
-    <w:p>
-      <w:pPr>
-        <w:pStyle w:val="ListParagraph"/>
-        <w:numPr>
-          <w:ilvl w:val="0"/>
-          <w:numId w:val="4"/>
-        </w:numPr>
-        <w:spacing w:after="0" w:before="0" w:line="480" w:lineRule="auto"/>
-      </w:pPr>
-      <w:r>
-        <w:rPr>
-          <w:rFonts w:ascii="Times New Roman" w:cs="Times New Roman" w:eastAsia="Times New Roman" w:hAnsi="Times New Roman"/>
-          <w:color w:val="000000"/>
-          <w:sz w:val="24"/>
-          <w:szCs w:val="24"/>
-        </w:rPr>
-        <w:t xml:space="preserve">Órdenes de corte</w:t>
-      </w:r>
-    </w:p>
-    <w:p>
-      <w:pPr>
-        <w:pStyle w:val="ListParagraph"/>
-        <w:numPr>
-          <w:ilvl w:val="0"/>
-          <w:numId w:val="4"/>
-        </w:numPr>
-        <w:spacing w:after="0" w:before="0" w:line="480" w:lineRule="auto"/>
-      </w:pPr>
-      <w:r>
-        <w:rPr>
-          <w:rFonts w:ascii="Times New Roman" w:cs="Times New Roman" w:eastAsia="Times New Roman" w:hAnsi="Times New Roman"/>
-          <w:color w:val="000000"/>
-          <w:sz w:val="24"/>
-          <w:szCs w:val="24"/>
-        </w:rPr>
-        <w:t xml:space="preserve">Asignaciones de órdenes</w:t>
-      </w:r>
-    </w:p>
-    <w:p>
-      <w:pPr>
-        <w:pStyle w:val="ListParagraph"/>
-        <w:numPr>
-          <w:ilvl w:val="0"/>
-          <w:numId w:val="4"/>
-        </w:numPr>
-        <w:spacing w:after="0" w:before="0" w:line="480" w:lineRule="auto"/>
-      </w:pPr>
-      <w:r>
-        <w:rPr>
-          <w:rFonts w:ascii="Times New Roman" w:cs="Times New Roman" w:eastAsia="Times New Roman" w:hAnsi="Times New Roman"/>
-          <w:color w:val="000000"/>
-          <w:sz w:val="24"/>
-          <w:szCs w:val="24"/>
-        </w:rPr>
-        <w:t xml:space="preserve">Operaciones de comando</w:t>
-      </w:r>
-    </w:p>
-    <w:p>
-      <w:pPr>
-        <w:pStyle w:val="ListParagraph"/>
-        <w:numPr>
-          <w:ilvl w:val="0"/>
-          <w:numId w:val="4"/>
-        </w:numPr>
-        <w:spacing w:after="0" w:before="0" w:line="480" w:lineRule="auto"/>
-      </w:pPr>
-      <w:r>
-        <w:rPr>
-          <w:rFonts w:ascii="Times New Roman" w:cs="Times New Roman" w:eastAsia="Times New Roman" w:hAnsi="Times New Roman"/>
-          <w:color w:val="000000"/>
-          <w:sz w:val="24"/>
-          <w:szCs w:val="24"/>
-        </w:rPr>
-        <w:t xml:space="preserve">Autorizaciones de corte</w:t>
-      </w:r>
-    </w:p>
-    <w:p>
-      <w:pPr>
-        <w:pStyle w:val="ListParagraph"/>
-        <w:numPr>
-          <w:ilvl w:val="0"/>
-          <w:numId w:val="4"/>
-        </w:numPr>
-        <w:spacing w:after="0" w:before="0" w:line="480" w:lineRule="auto"/>
-      </w:pPr>
-      <w:r>
-        <w:rPr>
-          <w:rFonts w:ascii="Times New Roman" w:cs="Times New Roman" w:eastAsia="Times New Roman" w:hAnsi="Times New Roman"/>
-          <w:color w:val="000000"/>
-          <w:sz w:val="24"/>
-          <w:szCs w:val="24"/>
-        </w:rPr>
-        <w:t xml:space="preserve">Operaciones de sincronización</w:t>
-      </w:r>
-    </w:p>
-    <w:p>
-      <w:pPr>
-        <w:pStyle w:val="ListParagraph"/>
-        <w:numPr>
-          <w:ilvl w:val="0"/>
-          <w:numId w:val="4"/>
-        </w:numPr>
-        <w:spacing w:after="0" w:before="0" w:line="480" w:lineRule="auto"/>
-      </w:pPr>
-      <w:r>
-        <w:rPr>
-          <w:rFonts w:ascii="Times New Roman" w:cs="Times New Roman" w:eastAsia="Times New Roman" w:hAnsi="Times New Roman"/>
-          <w:color w:val="000000"/>
-          <w:sz w:val="24"/>
-          <w:szCs w:val="24"/>
-        </w:rPr>
-        <w:t xml:space="preserve">Evidencias fotográficas</w:t>
-      </w:r>
-    </w:p>
-    <w:p>
-      <w:pPr>
-        <w:pStyle w:val="ListParagraph"/>
-        <w:numPr>
-          <w:ilvl w:val="0"/>
-          <w:numId w:val="4"/>
-        </w:numPr>
-        <w:spacing w:after="0" w:before="0" w:line="480" w:lineRule="auto"/>
-      </w:pPr>
-      <w:r>
-        <w:rPr>
-          <w:rFonts w:ascii="Times New Roman" w:cs="Times New Roman" w:eastAsia="Times New Roman" w:hAnsi="Times New Roman"/>
-          <w:color w:val="000000"/>
-          <w:sz w:val="24"/>
-          <w:szCs w:val="24"/>
-        </w:rPr>
-        <w:t xml:space="preserve">Versiones del paquete de trabajo</w:t>
-      </w:r>
-    </w:p>
-    <w:p>
-      <w:pPr>
-        <w:pStyle w:val="ListParagraph"/>
-        <w:numPr>
-          <w:ilvl w:val="0"/>
-          <w:numId w:val="4"/>
-        </w:numPr>
-        <w:spacing w:after="0" w:before="0" w:line="480" w:lineRule="auto"/>
-      </w:pPr>
-      <w:r>
-        <w:rPr>
-          <w:rFonts w:ascii="Times New Roman" w:cs="Times New Roman" w:eastAsia="Times New Roman" w:hAnsi="Times New Roman"/>
-          <w:color w:val="000000"/>
-          <w:sz w:val="24"/>
-          <w:szCs w:val="24"/>
-        </w:rPr>
-        <w:t xml:space="preserve">Eventos de auditoría</w:t>
-      </w:r>
-    </w:p>
-    <w:p>
-      <w:pPr>
-        <w:pStyle w:val="ListParagraph"/>
-        <w:numPr>
-          <w:ilvl w:val="0"/>
-          <w:numId w:val="4"/>
-        </w:numPr>
-        <w:spacing w:after="0" w:before="0" w:line="480" w:lineRule="auto"/>
-      </w:pPr>
-      <w:r>
-        <w:rPr>
-          <w:rFonts w:ascii="Times New Roman" w:cs="Times New Roman" w:eastAsia="Times New Roman" w:hAnsi="Times New Roman"/>
-          <w:color w:val="000000"/>
-          <w:sz w:val="24"/>
-          <w:szCs w:val="24"/>
-        </w:rPr>
-        <w:t xml:space="preserve">Observaciones de pago (legado, sin uso en el piloto)</w:t>
-      </w:r>
-    </w:p>
-    <w:p>
-      <w:pPr>
-        <w:pStyle w:val="Heading2"/>
+        <w:t xml:space="preserve">Diccionario de Datos</w:t>
+      </w:r>
+    </w:p>
+    <w:p>
+      <w:pPr>
+        <w:spacing w:after="0" w:before="0" w:line="480" w:lineRule="auto"/>
+        <w:ind w:firstLine="720"/>
+        <w:jc w:val="left"/>
+      </w:pPr>
+      <w:r>
+        <w:rPr>
+          <w:rFonts w:ascii="Times New Roman" w:cs="Times New Roman" w:eastAsia="Times New Roman" w:hAnsi="Times New Roman"/>
+          <w:color w:val="000000"/>
+          <w:sz w:val="24"/>
+          <w:szCs w:val="24"/>
+        </w:rPr>
+        <w:t xml:space="preserve">El diccionario describe las 13 tablas de la base de datos del piloto, con su función y sus campos principales. El detalle completo de los 147 campos forma parte de la documentación técnica.</w:t>
+      </w:r>
+    </w:p>
+    <w:p>
+      <w:pPr>
+        <w:spacing w:after="0" w:before="0" w:line="240"/>
       </w:pPr>
       <w:r>
         <w:rPr>
@@ -827,7 +596,1235 @@
           <w:sz w:val="24"/>
           <w:szCs w:val="24"/>
         </w:rPr>
-        <w:t xml:space="preserve">Diccionario de Datos</w:t>
+        <w:t xml:space="preserve">Tabla 1</w:t>
+      </w:r>
+    </w:p>
+    <w:p>
+      <w:pPr>
+        <w:spacing w:after="160" w:before="0" w:line="240"/>
+      </w:pPr>
+      <w:r>
+        <w:rPr>
+          <w:rFonts w:ascii="Times New Roman" w:cs="Times New Roman" w:eastAsia="Times New Roman" w:hAnsi="Times New Roman"/>
+          <w:i/>
+          <w:iCs/>
+          <w:color w:val="000000"/>
+          <w:sz w:val="24"/>
+          <w:szCs w:val="24"/>
+        </w:rPr>
+        <w:t xml:space="preserve">Tablas de la base de datos del piloto</w:t>
+      </w:r>
+    </w:p>
+    <w:tbl>
+      <w:tblPr>
+        <w:tblW w:type="dxa" w:w="9360"/>
+        <w:tblBorders>
+          <w:top w:val="none" w:color="FFFFFF" w:sz="0"/>
+          <w:left w:val="none" w:color="FFFFFF" w:sz="0"/>
+          <w:bottom w:val="none" w:color="FFFFFF" w:sz="0"/>
+          <w:right w:val="none" w:color="FFFFFF" w:sz="0"/>
+          <w:insideH w:val="none" w:color="FFFFFF" w:sz="0"/>
+          <w:insideV w:val="none" w:color="FFFFFF" w:sz="0"/>
+        </w:tblBorders>
+      </w:tblPr>
+      <w:tblGrid>
+        <w:gridCol w:w="2100"/>
+        <w:gridCol w:w="2900"/>
+        <w:gridCol w:w="4360"/>
+      </w:tblGrid>
+      <w:tr>
+        <w:trPr>
+          <w:tblHeader/>
+        </w:trPr>
+        <w:tc>
+          <w:tcPr>
+            <w:tcW w:type="dxa" w:w="2100"/>
+            <w:tcBorders>
+              <w:top w:val="single" w:color="000000" w:sz="6"/>
+              <w:left w:val="none" w:color="FFFFFF" w:sz="0"/>
+              <w:bottom w:val="single" w:color="000000" w:sz="6"/>
+              <w:right w:val="none" w:color="FFFFFF" w:sz="0"/>
+            </w:tcBorders>
+          </w:tcPr>
+          <w:p>
+            <w:pPr>
+              <w:spacing w:after="40" w:before="40" w:line="240"/>
+            </w:pPr>
+            <w:r>
+              <w:rPr>
+                <w:rFonts w:ascii="Times New Roman" w:cs="Times New Roman" w:eastAsia="Times New Roman" w:hAnsi="Times New Roman"/>
+                <w:b/>
+                <w:bCs/>
+                <w:color w:val="000000"/>
+                <w:sz w:val="20"/>
+                <w:szCs w:val="20"/>
+              </w:rPr>
+              <w:t xml:space="preserve">Tabla</w:t>
+            </w:r>
+          </w:p>
+        </w:tc>
+        <w:tc>
+          <w:tcPr>
+            <w:tcW w:type="dxa" w:w="2900"/>
+            <w:tcBorders>
+              <w:top w:val="single" w:color="000000" w:sz="6"/>
+              <w:left w:val="none" w:color="FFFFFF" w:sz="0"/>
+              <w:bottom w:val="single" w:color="000000" w:sz="6"/>
+              <w:right w:val="none" w:color="FFFFFF" w:sz="0"/>
+            </w:tcBorders>
+          </w:tcPr>
+          <w:p>
+            <w:pPr>
+              <w:spacing w:after="40" w:before="40" w:line="240"/>
+            </w:pPr>
+            <w:r>
+              <w:rPr>
+                <w:rFonts w:ascii="Times New Roman" w:cs="Times New Roman" w:eastAsia="Times New Roman" w:hAnsi="Times New Roman"/>
+                <w:b/>
+                <w:bCs/>
+                <w:color w:val="000000"/>
+                <w:sz w:val="20"/>
+                <w:szCs w:val="20"/>
+              </w:rPr>
+              <w:t xml:space="preserve">Qué guarda</w:t>
+            </w:r>
+          </w:p>
+        </w:tc>
+        <w:tc>
+          <w:tcPr>
+            <w:tcW w:type="dxa" w:w="4360"/>
+            <w:tcBorders>
+              <w:top w:val="single" w:color="000000" w:sz="6"/>
+              <w:left w:val="none" w:color="FFFFFF" w:sz="0"/>
+              <w:bottom w:val="single" w:color="000000" w:sz="6"/>
+              <w:right w:val="none" w:color="FFFFFF" w:sz="0"/>
+            </w:tcBorders>
+          </w:tcPr>
+          <w:p>
+            <w:pPr>
+              <w:spacing w:after="40" w:before="40" w:line="240"/>
+            </w:pPr>
+            <w:r>
+              <w:rPr>
+                <w:rFonts w:ascii="Times New Roman" w:cs="Times New Roman" w:eastAsia="Times New Roman" w:hAnsi="Times New Roman"/>
+                <w:b/>
+                <w:bCs/>
+                <w:color w:val="000000"/>
+                <w:sz w:val="20"/>
+                <w:szCs w:val="20"/>
+              </w:rPr>
+              <w:t xml:space="preserve">Campos principales</w:t>
+            </w:r>
+          </w:p>
+        </w:tc>
+      </w:tr>
+      <w:tr>
+        <w:tc>
+          <w:tcPr>
+            <w:tcW w:type="dxa" w:w="2100"/>
+            <w:tcBorders>
+              <w:top w:val="none" w:color="FFFFFF" w:sz="0"/>
+              <w:left w:val="none" w:color="FFFFFF" w:sz="0"/>
+              <w:bottom w:val="none" w:color="FFFFFF" w:sz="0"/>
+              <w:right w:val="none" w:color="FFFFFF" w:sz="0"/>
+            </w:tcBorders>
+          </w:tcPr>
+          <w:p>
+            <w:pPr>
+              <w:spacing w:after="40" w:before="40" w:line="240"/>
+            </w:pPr>
+            <w:r>
+              <w:rPr>
+                <w:rFonts w:ascii="Times New Roman" w:cs="Times New Roman" w:eastAsia="Times New Roman" w:hAnsi="Times New Roman"/>
+                <w:b w:val="false"/>
+                <w:bCs w:val="false"/>
+                <w:color w:val="000000"/>
+                <w:sz w:val="20"/>
+                <w:szCs w:val="20"/>
+              </w:rPr>
+              <w:t xml:space="preserve">Usuarios</w:t>
+            </w:r>
+          </w:p>
+        </w:tc>
+        <w:tc>
+          <w:tcPr>
+            <w:tcW w:type="dxa" w:w="2900"/>
+            <w:tcBorders>
+              <w:top w:val="none" w:color="FFFFFF" w:sz="0"/>
+              <w:left w:val="none" w:color="FFFFFF" w:sz="0"/>
+              <w:bottom w:val="none" w:color="FFFFFF" w:sz="0"/>
+              <w:right w:val="none" w:color="FFFFFF" w:sz="0"/>
+            </w:tcBorders>
+          </w:tcPr>
+          <w:p>
+            <w:pPr>
+              <w:spacing w:after="40" w:before="40" w:line="240"/>
+            </w:pPr>
+            <w:r>
+              <w:rPr>
+                <w:rFonts w:ascii="Times New Roman" w:cs="Times New Roman" w:eastAsia="Times New Roman" w:hAnsi="Times New Roman"/>
+                <w:b w:val="false"/>
+                <w:bCs w:val="false"/>
+                <w:color w:val="000000"/>
+                <w:sz w:val="20"/>
+                <w:szCs w:val="20"/>
+              </w:rPr>
+              <w:t xml:space="preserve">Cuentas de administradores y técnicos</w:t>
+            </w:r>
+          </w:p>
+        </w:tc>
+        <w:tc>
+          <w:tcPr>
+            <w:tcW w:type="dxa" w:w="4360"/>
+            <w:tcBorders>
+              <w:top w:val="none" w:color="FFFFFF" w:sz="0"/>
+              <w:left w:val="none" w:color="FFFFFF" w:sz="0"/>
+              <w:bottom w:val="none" w:color="FFFFFF" w:sz="0"/>
+              <w:right w:val="none" w:color="FFFFFF" w:sz="0"/>
+            </w:tcBorders>
+          </w:tcPr>
+          <w:p>
+            <w:pPr>
+              <w:spacing w:after="40" w:before="40" w:line="240"/>
+            </w:pPr>
+            <w:r>
+              <w:rPr>
+                <w:rFonts w:ascii="Times New Roman" w:cs="Times New Roman" w:eastAsia="Times New Roman" w:hAnsi="Times New Roman"/>
+                <w:b w:val="false"/>
+                <w:bCs w:val="false"/>
+                <w:color w:val="000000"/>
+                <w:sz w:val="20"/>
+                <w:szCs w:val="20"/>
+              </w:rPr>
+              <w:t xml:space="preserve">Nombre de acceso, nombre visible, rol inicial, contraseña protegida y si la cuenta está activa</w:t>
+            </w:r>
+          </w:p>
+        </w:tc>
+      </w:tr>
+      <w:tr>
+        <w:tc>
+          <w:tcPr>
+            <w:tcW w:type="dxa" w:w="2100"/>
+            <w:tcBorders>
+              <w:top w:val="none" w:color="FFFFFF" w:sz="0"/>
+              <w:left w:val="none" w:color="FFFFFF" w:sz="0"/>
+              <w:bottom w:val="none" w:color="FFFFFF" w:sz="0"/>
+              <w:right w:val="none" w:color="FFFFFF" w:sz="0"/>
+            </w:tcBorders>
+          </w:tcPr>
+          <w:p>
+            <w:pPr>
+              <w:spacing w:after="40" w:before="40" w:line="240"/>
+            </w:pPr>
+            <w:r>
+              <w:rPr>
+                <w:rFonts w:ascii="Times New Roman" w:cs="Times New Roman" w:eastAsia="Times New Roman" w:hAnsi="Times New Roman"/>
+                <w:b w:val="false"/>
+                <w:bCs w:val="false"/>
+                <w:color w:val="000000"/>
+                <w:sz w:val="20"/>
+                <w:szCs w:val="20"/>
+              </w:rPr>
+              <w:t xml:space="preserve">Roles de usuario</w:t>
+            </w:r>
+          </w:p>
+        </w:tc>
+        <w:tc>
+          <w:tcPr>
+            <w:tcW w:type="dxa" w:w="2900"/>
+            <w:tcBorders>
+              <w:top w:val="none" w:color="FFFFFF" w:sz="0"/>
+              <w:left w:val="none" w:color="FFFFFF" w:sz="0"/>
+              <w:bottom w:val="none" w:color="FFFFFF" w:sz="0"/>
+              <w:right w:val="none" w:color="FFFFFF" w:sz="0"/>
+            </w:tcBorders>
+          </w:tcPr>
+          <w:p>
+            <w:pPr>
+              <w:spacing w:after="40" w:before="40" w:line="240"/>
+            </w:pPr>
+            <w:r>
+              <w:rPr>
+                <w:rFonts w:ascii="Times New Roman" w:cs="Times New Roman" w:eastAsia="Times New Roman" w:hAnsi="Times New Roman"/>
+                <w:b w:val="false"/>
+                <w:bCs w:val="false"/>
+                <w:color w:val="000000"/>
+                <w:sz w:val="20"/>
+                <w:szCs w:val="20"/>
+              </w:rPr>
+              <w:t xml:space="preserve">Roles que tiene cada usuario</w:t>
+            </w:r>
+          </w:p>
+        </w:tc>
+        <w:tc>
+          <w:tcPr>
+            <w:tcW w:type="dxa" w:w="4360"/>
+            <w:tcBorders>
+              <w:top w:val="none" w:color="FFFFFF" w:sz="0"/>
+              <w:left w:val="none" w:color="FFFFFF" w:sz="0"/>
+              <w:bottom w:val="none" w:color="FFFFFF" w:sz="0"/>
+              <w:right w:val="none" w:color="FFFFFF" w:sz="0"/>
+            </w:tcBorders>
+          </w:tcPr>
+          <w:p>
+            <w:pPr>
+              <w:spacing w:after="40" w:before="40" w:line="240"/>
+            </w:pPr>
+            <w:r>
+              <w:rPr>
+                <w:rFonts w:ascii="Times New Roman" w:cs="Times New Roman" w:eastAsia="Times New Roman" w:hAnsi="Times New Roman"/>
+                <w:b w:val="false"/>
+                <w:bCs w:val="false"/>
+                <w:color w:val="000000"/>
+                <w:sz w:val="20"/>
+                <w:szCs w:val="20"/>
+              </w:rPr>
+              <w:t xml:space="preserve">Usuario y rol concedido (administrador o técnico)</w:t>
+            </w:r>
+          </w:p>
+        </w:tc>
+      </w:tr>
+      <w:tr>
+        <w:tc>
+          <w:tcPr>
+            <w:tcW w:type="dxa" w:w="2100"/>
+            <w:tcBorders>
+              <w:top w:val="none" w:color="FFFFFF" w:sz="0"/>
+              <w:left w:val="none" w:color="FFFFFF" w:sz="0"/>
+              <w:bottom w:val="none" w:color="FFFFFF" w:sz="0"/>
+              <w:right w:val="none" w:color="FFFFFF" w:sz="0"/>
+            </w:tcBorders>
+          </w:tcPr>
+          <w:p>
+            <w:pPr>
+              <w:spacing w:after="40" w:before="40" w:line="240"/>
+            </w:pPr>
+            <w:r>
+              <w:rPr>
+                <w:rFonts w:ascii="Times New Roman" w:cs="Times New Roman" w:eastAsia="Times New Roman" w:hAnsi="Times New Roman"/>
+                <w:b w:val="false"/>
+                <w:bCs w:val="false"/>
+                <w:color w:val="000000"/>
+                <w:sz w:val="20"/>
+                <w:szCs w:val="20"/>
+              </w:rPr>
+              <w:t xml:space="preserve">Sesiones</w:t>
+            </w:r>
+          </w:p>
+        </w:tc>
+        <w:tc>
+          <w:tcPr>
+            <w:tcW w:type="dxa" w:w="2900"/>
+            <w:tcBorders>
+              <w:top w:val="none" w:color="FFFFFF" w:sz="0"/>
+              <w:left w:val="none" w:color="FFFFFF" w:sz="0"/>
+              <w:bottom w:val="none" w:color="FFFFFF" w:sz="0"/>
+              <w:right w:val="none" w:color="FFFFFF" w:sz="0"/>
+            </w:tcBorders>
+          </w:tcPr>
+          <w:p>
+            <w:pPr>
+              <w:spacing w:after="40" w:before="40" w:line="240"/>
+            </w:pPr>
+            <w:r>
+              <w:rPr>
+                <w:rFonts w:ascii="Times New Roman" w:cs="Times New Roman" w:eastAsia="Times New Roman" w:hAnsi="Times New Roman"/>
+                <w:b w:val="false"/>
+                <w:bCs w:val="false"/>
+                <w:color w:val="000000"/>
+                <w:sz w:val="20"/>
+                <w:szCs w:val="20"/>
+              </w:rPr>
+              <w:t xml:space="preserve">Accesos abiertos al sistema</w:t>
+            </w:r>
+          </w:p>
+        </w:tc>
+        <w:tc>
+          <w:tcPr>
+            <w:tcW w:type="dxa" w:w="4360"/>
+            <w:tcBorders>
+              <w:top w:val="none" w:color="FFFFFF" w:sz="0"/>
+              <w:left w:val="none" w:color="FFFFFF" w:sz="0"/>
+              <w:bottom w:val="none" w:color="FFFFFF" w:sz="0"/>
+              <w:right w:val="none" w:color="FFFFFF" w:sz="0"/>
+            </w:tcBorders>
+          </w:tcPr>
+          <w:p>
+            <w:pPr>
+              <w:spacing w:after="40" w:before="40" w:line="240"/>
+            </w:pPr>
+            <w:r>
+              <w:rPr>
+                <w:rFonts w:ascii="Times New Roman" w:cs="Times New Roman" w:eastAsia="Times New Roman" w:hAnsi="Times New Roman"/>
+                <w:b w:val="false"/>
+                <w:bCs w:val="false"/>
+                <w:color w:val="000000"/>
+                <w:sz w:val="20"/>
+                <w:szCs w:val="20"/>
+              </w:rPr>
+              <w:t xml:space="preserve">Usuario, rol activo, fecha de vencimiento y fecha de cierre</w:t>
+            </w:r>
+          </w:p>
+        </w:tc>
+      </w:tr>
+      <w:tr>
+        <w:tc>
+          <w:tcPr>
+            <w:tcW w:type="dxa" w:w="2100"/>
+            <w:tcBorders>
+              <w:top w:val="none" w:color="FFFFFF" w:sz="0"/>
+              <w:left w:val="none" w:color="FFFFFF" w:sz="0"/>
+              <w:bottom w:val="none" w:color="FFFFFF" w:sz="0"/>
+              <w:right w:val="none" w:color="FFFFFF" w:sz="0"/>
+            </w:tcBorders>
+          </w:tcPr>
+          <w:p>
+            <w:pPr>
+              <w:spacing w:after="40" w:before="40" w:line="240"/>
+            </w:pPr>
+            <w:r>
+              <w:rPr>
+                <w:rFonts w:ascii="Times New Roman" w:cs="Times New Roman" w:eastAsia="Times New Roman" w:hAnsi="Times New Roman"/>
+                <w:b w:val="false"/>
+                <w:bCs w:val="false"/>
+                <w:color w:val="000000"/>
+                <w:sz w:val="20"/>
+                <w:szCs w:val="20"/>
+              </w:rPr>
+              <w:t xml:space="preserve">Morosos y suministros</w:t>
+            </w:r>
+          </w:p>
+        </w:tc>
+        <w:tc>
+          <w:tcPr>
+            <w:tcW w:type="dxa" w:w="2900"/>
+            <w:tcBorders>
+              <w:top w:val="none" w:color="FFFFFF" w:sz="0"/>
+              <w:left w:val="none" w:color="FFFFFF" w:sz="0"/>
+              <w:bottom w:val="none" w:color="FFFFFF" w:sz="0"/>
+              <w:right w:val="none" w:color="FFFFFF" w:sz="0"/>
+            </w:tcBorders>
+          </w:tcPr>
+          <w:p>
+            <w:pPr>
+              <w:spacing w:after="40" w:before="40" w:line="240"/>
+            </w:pPr>
+            <w:r>
+              <w:rPr>
+                <w:rFonts w:ascii="Times New Roman" w:cs="Times New Roman" w:eastAsia="Times New Roman" w:hAnsi="Times New Roman"/>
+                <w:b w:val="false"/>
+                <w:bCs w:val="false"/>
+                <w:color w:val="000000"/>
+                <w:sz w:val="20"/>
+                <w:szCs w:val="20"/>
+              </w:rPr>
+              <w:t xml:space="preserve">Clientes con deuda cargados para el piloto</w:t>
+            </w:r>
+          </w:p>
+        </w:tc>
+        <w:tc>
+          <w:tcPr>
+            <w:tcW w:type="dxa" w:w="4360"/>
+            <w:tcBorders>
+              <w:top w:val="none" w:color="FFFFFF" w:sz="0"/>
+              <w:left w:val="none" w:color="FFFFFF" w:sz="0"/>
+              <w:bottom w:val="none" w:color="FFFFFF" w:sz="0"/>
+              <w:right w:val="none" w:color="FFFFFF" w:sz="0"/>
+            </w:tcBorders>
+          </w:tcPr>
+          <w:p>
+            <w:pPr>
+              <w:spacing w:after="40" w:before="40" w:line="240"/>
+            </w:pPr>
+            <w:r>
+              <w:rPr>
+                <w:rFonts w:ascii="Times New Roman" w:cs="Times New Roman" w:eastAsia="Times New Roman" w:hAnsi="Times New Roman"/>
+                <w:b w:val="false"/>
+                <w:bCs w:val="false"/>
+                <w:color w:val="000000"/>
+                <w:sz w:val="20"/>
+                <w:szCs w:val="20"/>
+              </w:rPr>
+              <w:t xml:space="preserve">Cuenta, suministro, nombre, dirección, medidor, área, localidad, ruta, deuda en centavos y meses pendientes</w:t>
+            </w:r>
+          </w:p>
+        </w:tc>
+      </w:tr>
+      <w:tr>
+        <w:tc>
+          <w:tcPr>
+            <w:tcW w:type="dxa" w:w="2100"/>
+            <w:tcBorders>
+              <w:top w:val="none" w:color="FFFFFF" w:sz="0"/>
+              <w:left w:val="none" w:color="FFFFFF" w:sz="0"/>
+              <w:bottom w:val="none" w:color="FFFFFF" w:sz="0"/>
+              <w:right w:val="none" w:color="FFFFFF" w:sz="0"/>
+            </w:tcBorders>
+          </w:tcPr>
+          <w:p>
+            <w:pPr>
+              <w:spacing w:after="40" w:before="40" w:line="240"/>
+            </w:pPr>
+            <w:r>
+              <w:rPr>
+                <w:rFonts w:ascii="Times New Roman" w:cs="Times New Roman" w:eastAsia="Times New Roman" w:hAnsi="Times New Roman"/>
+                <w:b w:val="false"/>
+                <w:bCs w:val="false"/>
+                <w:color w:val="000000"/>
+                <w:sz w:val="20"/>
+                <w:szCs w:val="20"/>
+              </w:rPr>
+              <w:t xml:space="preserve">Órdenes de corte</w:t>
+            </w:r>
+          </w:p>
+        </w:tc>
+        <w:tc>
+          <w:tcPr>
+            <w:tcW w:type="dxa" w:w="2900"/>
+            <w:tcBorders>
+              <w:top w:val="none" w:color="FFFFFF" w:sz="0"/>
+              <w:left w:val="none" w:color="FFFFFF" w:sz="0"/>
+              <w:bottom w:val="none" w:color="FFFFFF" w:sz="0"/>
+              <w:right w:val="none" w:color="FFFFFF" w:sz="0"/>
+            </w:tcBorders>
+          </w:tcPr>
+          <w:p>
+            <w:pPr>
+              <w:spacing w:after="40" w:before="40" w:line="240"/>
+            </w:pPr>
+            <w:r>
+              <w:rPr>
+                <w:rFonts w:ascii="Times New Roman" w:cs="Times New Roman" w:eastAsia="Times New Roman" w:hAnsi="Times New Roman"/>
+                <w:b w:val="false"/>
+                <w:bCs w:val="false"/>
+                <w:color w:val="000000"/>
+                <w:sz w:val="20"/>
+                <w:szCs w:val="20"/>
+              </w:rPr>
+              <w:t xml:space="preserve">Órdenes generadas para cada suministro</w:t>
+            </w:r>
+          </w:p>
+        </w:tc>
+        <w:tc>
+          <w:tcPr>
+            <w:tcW w:type="dxa" w:w="4360"/>
+            <w:tcBorders>
+              <w:top w:val="none" w:color="FFFFFF" w:sz="0"/>
+              <w:left w:val="none" w:color="FFFFFF" w:sz="0"/>
+              <w:bottom w:val="none" w:color="FFFFFF" w:sz="0"/>
+              <w:right w:val="none" w:color="FFFFFF" w:sz="0"/>
+            </w:tcBorders>
+          </w:tcPr>
+          <w:p>
+            <w:pPr>
+              <w:spacing w:after="40" w:before="40" w:line="240"/>
+            </w:pPr>
+            <w:r>
+              <w:rPr>
+                <w:rFonts w:ascii="Times New Roman" w:cs="Times New Roman" w:eastAsia="Times New Roman" w:hAnsi="Times New Roman"/>
+                <w:b w:val="false"/>
+                <w:bCs w:val="false"/>
+                <w:color w:val="000000"/>
+                <w:sz w:val="20"/>
+                <w:szCs w:val="20"/>
+              </w:rPr>
+              <w:t xml:space="preserve">Código de la orden, suministro, estado, estado físico, versión y técnico asignado</w:t>
+            </w:r>
+          </w:p>
+        </w:tc>
+      </w:tr>
+      <w:tr>
+        <w:tc>
+          <w:tcPr>
+            <w:tcW w:type="dxa" w:w="2100"/>
+            <w:tcBorders>
+              <w:top w:val="none" w:color="FFFFFF" w:sz="0"/>
+              <w:left w:val="none" w:color="FFFFFF" w:sz="0"/>
+              <w:bottom w:val="none" w:color="FFFFFF" w:sz="0"/>
+              <w:right w:val="none" w:color="FFFFFF" w:sz="0"/>
+            </w:tcBorders>
+          </w:tcPr>
+          <w:p>
+            <w:pPr>
+              <w:spacing w:after="40" w:before="40" w:line="240"/>
+            </w:pPr>
+            <w:r>
+              <w:rPr>
+                <w:rFonts w:ascii="Times New Roman" w:cs="Times New Roman" w:eastAsia="Times New Roman" w:hAnsi="Times New Roman"/>
+                <w:b w:val="false"/>
+                <w:bCs w:val="false"/>
+                <w:color w:val="000000"/>
+                <w:sz w:val="20"/>
+                <w:szCs w:val="20"/>
+              </w:rPr>
+              <w:t xml:space="preserve">Asignaciones de órdenes</w:t>
+            </w:r>
+          </w:p>
+        </w:tc>
+        <w:tc>
+          <w:tcPr>
+            <w:tcW w:type="dxa" w:w="2900"/>
+            <w:tcBorders>
+              <w:top w:val="none" w:color="FFFFFF" w:sz="0"/>
+              <w:left w:val="none" w:color="FFFFFF" w:sz="0"/>
+              <w:bottom w:val="none" w:color="FFFFFF" w:sz="0"/>
+              <w:right w:val="none" w:color="FFFFFF" w:sz="0"/>
+            </w:tcBorders>
+          </w:tcPr>
+          <w:p>
+            <w:pPr>
+              <w:spacing w:after="40" w:before="40" w:line="240"/>
+            </w:pPr>
+            <w:r>
+              <w:rPr>
+                <w:rFonts w:ascii="Times New Roman" w:cs="Times New Roman" w:eastAsia="Times New Roman" w:hAnsi="Times New Roman"/>
+                <w:b w:val="false"/>
+                <w:bCs w:val="false"/>
+                <w:color w:val="000000"/>
+                <w:sz w:val="20"/>
+                <w:szCs w:val="20"/>
+              </w:rPr>
+              <w:t xml:space="preserve">Historial de asignaciones de cada orden</w:t>
+            </w:r>
+          </w:p>
+        </w:tc>
+        <w:tc>
+          <w:tcPr>
+            <w:tcW w:type="dxa" w:w="4360"/>
+            <w:tcBorders>
+              <w:top w:val="none" w:color="FFFFFF" w:sz="0"/>
+              <w:left w:val="none" w:color="FFFFFF" w:sz="0"/>
+              <w:bottom w:val="none" w:color="FFFFFF" w:sz="0"/>
+              <w:right w:val="none" w:color="FFFFFF" w:sz="0"/>
+            </w:tcBorders>
+          </w:tcPr>
+          <w:p>
+            <w:pPr>
+              <w:spacing w:after="40" w:before="40" w:line="240"/>
+            </w:pPr>
+            <w:r>
+              <w:rPr>
+                <w:rFonts w:ascii="Times New Roman" w:cs="Times New Roman" w:eastAsia="Times New Roman" w:hAnsi="Times New Roman"/>
+                <w:b w:val="false"/>
+                <w:bCs w:val="false"/>
+                <w:color w:val="000000"/>
+                <w:sz w:val="20"/>
+                <w:szCs w:val="20"/>
+              </w:rPr>
+              <w:t xml:space="preserve">Orden, técnico asignado, técnico anterior, quién asignó y fecha</w:t>
+            </w:r>
+          </w:p>
+        </w:tc>
+      </w:tr>
+      <w:tr>
+        <w:tc>
+          <w:tcPr>
+            <w:tcW w:type="dxa" w:w="2100"/>
+            <w:tcBorders>
+              <w:top w:val="none" w:color="FFFFFF" w:sz="0"/>
+              <w:left w:val="none" w:color="FFFFFF" w:sz="0"/>
+              <w:bottom w:val="none" w:color="FFFFFF" w:sz="0"/>
+              <w:right w:val="none" w:color="FFFFFF" w:sz="0"/>
+            </w:tcBorders>
+          </w:tcPr>
+          <w:p>
+            <w:pPr>
+              <w:spacing w:after="40" w:before="40" w:line="240"/>
+            </w:pPr>
+            <w:r>
+              <w:rPr>
+                <w:rFonts w:ascii="Times New Roman" w:cs="Times New Roman" w:eastAsia="Times New Roman" w:hAnsi="Times New Roman"/>
+                <w:b w:val="false"/>
+                <w:bCs w:val="false"/>
+                <w:color w:val="000000"/>
+                <w:sz w:val="20"/>
+                <w:szCs w:val="20"/>
+              </w:rPr>
+              <w:t xml:space="preserve">Operaciones de comando</w:t>
+            </w:r>
+          </w:p>
+        </w:tc>
+        <w:tc>
+          <w:tcPr>
+            <w:tcW w:type="dxa" w:w="2900"/>
+            <w:tcBorders>
+              <w:top w:val="none" w:color="FFFFFF" w:sz="0"/>
+              <w:left w:val="none" w:color="FFFFFF" w:sz="0"/>
+              <w:bottom w:val="none" w:color="FFFFFF" w:sz="0"/>
+              <w:right w:val="none" w:color="FFFFFF" w:sz="0"/>
+            </w:tcBorders>
+          </w:tcPr>
+          <w:p>
+            <w:pPr>
+              <w:spacing w:after="40" w:before="40" w:line="240"/>
+            </w:pPr>
+            <w:r>
+              <w:rPr>
+                <w:rFonts w:ascii="Times New Roman" w:cs="Times New Roman" w:eastAsia="Times New Roman" w:hAnsi="Times New Roman"/>
+                <w:b w:val="false"/>
+                <w:bCs w:val="false"/>
+                <w:color w:val="000000"/>
+                <w:sz w:val="20"/>
+                <w:szCs w:val="20"/>
+              </w:rPr>
+              <w:t xml:space="preserve">Acciones ejecutadas por un usuario</w:t>
+            </w:r>
+          </w:p>
+        </w:tc>
+        <w:tc>
+          <w:tcPr>
+            <w:tcW w:type="dxa" w:w="4360"/>
+            <w:tcBorders>
+              <w:top w:val="none" w:color="FFFFFF" w:sz="0"/>
+              <w:left w:val="none" w:color="FFFFFF" w:sz="0"/>
+              <w:bottom w:val="none" w:color="FFFFFF" w:sz="0"/>
+              <w:right w:val="none" w:color="FFFFFF" w:sz="0"/>
+            </w:tcBorders>
+          </w:tcPr>
+          <w:p>
+            <w:pPr>
+              <w:spacing w:after="40" w:before="40" w:line="240"/>
+            </w:pPr>
+            <w:r>
+              <w:rPr>
+                <w:rFonts w:ascii="Times New Roman" w:cs="Times New Roman" w:eastAsia="Times New Roman" w:hAnsi="Times New Roman"/>
+                <w:b w:val="false"/>
+                <w:bCs w:val="false"/>
+                <w:color w:val="000000"/>
+                <w:sz w:val="20"/>
+                <w:szCs w:val="20"/>
+              </w:rPr>
+              <w:t xml:space="preserve">Identificador de la operación, usuario, tipo, estado y respuesta guardada</w:t>
+            </w:r>
+          </w:p>
+        </w:tc>
+      </w:tr>
+      <w:tr>
+        <w:tc>
+          <w:tcPr>
+            <w:tcW w:type="dxa" w:w="2100"/>
+            <w:tcBorders>
+              <w:top w:val="none" w:color="FFFFFF" w:sz="0"/>
+              <w:left w:val="none" w:color="FFFFFF" w:sz="0"/>
+              <w:bottom w:val="none" w:color="FFFFFF" w:sz="0"/>
+              <w:right w:val="none" w:color="FFFFFF" w:sz="0"/>
+            </w:tcBorders>
+          </w:tcPr>
+          <w:p>
+            <w:pPr>
+              <w:spacing w:after="40" w:before="40" w:line="240"/>
+            </w:pPr>
+            <w:r>
+              <w:rPr>
+                <w:rFonts w:ascii="Times New Roman" w:cs="Times New Roman" w:eastAsia="Times New Roman" w:hAnsi="Times New Roman"/>
+                <w:b w:val="false"/>
+                <w:bCs w:val="false"/>
+                <w:color w:val="000000"/>
+                <w:sz w:val="20"/>
+                <w:szCs w:val="20"/>
+              </w:rPr>
+              <w:t xml:space="preserve">Autorizaciones de corte</w:t>
+            </w:r>
+          </w:p>
+        </w:tc>
+        <w:tc>
+          <w:tcPr>
+            <w:tcW w:type="dxa" w:w="2900"/>
+            <w:tcBorders>
+              <w:top w:val="none" w:color="FFFFFF" w:sz="0"/>
+              <w:left w:val="none" w:color="FFFFFF" w:sz="0"/>
+              <w:bottom w:val="none" w:color="FFFFFF" w:sz="0"/>
+              <w:right w:val="none" w:color="FFFFFF" w:sz="0"/>
+            </w:tcBorders>
+          </w:tcPr>
+          <w:p>
+            <w:pPr>
+              <w:spacing w:after="40" w:before="40" w:line="240"/>
+            </w:pPr>
+            <w:r>
+              <w:rPr>
+                <w:rFonts w:ascii="Times New Roman" w:cs="Times New Roman" w:eastAsia="Times New Roman" w:hAnsi="Times New Roman"/>
+                <w:b w:val="false"/>
+                <w:bCs w:val="false"/>
+                <w:color w:val="000000"/>
+                <w:sz w:val="20"/>
+                <w:szCs w:val="20"/>
+              </w:rPr>
+              <w:t xml:space="preserve">Permisos de un solo uso para cortar o reconectar</w:t>
+            </w:r>
+          </w:p>
+        </w:tc>
+        <w:tc>
+          <w:tcPr>
+            <w:tcW w:type="dxa" w:w="4360"/>
+            <w:tcBorders>
+              <w:top w:val="none" w:color="FFFFFF" w:sz="0"/>
+              <w:left w:val="none" w:color="FFFFFF" w:sz="0"/>
+              <w:bottom w:val="none" w:color="FFFFFF" w:sz="0"/>
+              <w:right w:val="none" w:color="FFFFFF" w:sz="0"/>
+            </w:tcBorders>
+          </w:tcPr>
+          <w:p>
+            <w:pPr>
+              <w:spacing w:after="40" w:before="40" w:line="240"/>
+            </w:pPr>
+            <w:r>
+              <w:rPr>
+                <w:rFonts w:ascii="Times New Roman" w:cs="Times New Roman" w:eastAsia="Times New Roman" w:hAnsi="Times New Roman"/>
+                <w:b w:val="false"/>
+                <w:bCs w:val="false"/>
+                <w:color w:val="000000"/>
+                <w:sz w:val="20"/>
+                <w:szCs w:val="20"/>
+              </w:rPr>
+              <w:t xml:space="preserve">Orden, técnico, dispositivo, estado, vencimiento y fecha de uso</w:t>
+            </w:r>
+          </w:p>
+        </w:tc>
+      </w:tr>
+      <w:tr>
+        <w:tc>
+          <w:tcPr>
+            <w:tcW w:type="dxa" w:w="2100"/>
+            <w:tcBorders>
+              <w:top w:val="none" w:color="FFFFFF" w:sz="0"/>
+              <w:left w:val="none" w:color="FFFFFF" w:sz="0"/>
+              <w:bottom w:val="none" w:color="FFFFFF" w:sz="0"/>
+              <w:right w:val="none" w:color="FFFFFF" w:sz="0"/>
+            </w:tcBorders>
+          </w:tcPr>
+          <w:p>
+            <w:pPr>
+              <w:spacing w:after="40" w:before="40" w:line="240"/>
+            </w:pPr>
+            <w:r>
+              <w:rPr>
+                <w:rFonts w:ascii="Times New Roman" w:cs="Times New Roman" w:eastAsia="Times New Roman" w:hAnsi="Times New Roman"/>
+                <w:b w:val="false"/>
+                <w:bCs w:val="false"/>
+                <w:color w:val="000000"/>
+                <w:sz w:val="20"/>
+                <w:szCs w:val="20"/>
+              </w:rPr>
+              <w:t xml:space="preserve">Operaciones de sincronización</w:t>
+            </w:r>
+          </w:p>
+        </w:tc>
+        <w:tc>
+          <w:tcPr>
+            <w:tcW w:type="dxa" w:w="2900"/>
+            <w:tcBorders>
+              <w:top w:val="none" w:color="FFFFFF" w:sz="0"/>
+              <w:left w:val="none" w:color="FFFFFF" w:sz="0"/>
+              <w:bottom w:val="none" w:color="FFFFFF" w:sz="0"/>
+              <w:right w:val="none" w:color="FFFFFF" w:sz="0"/>
+            </w:tcBorders>
+          </w:tcPr>
+          <w:p>
+            <w:pPr>
+              <w:spacing w:after="40" w:before="40" w:line="240"/>
+            </w:pPr>
+            <w:r>
+              <w:rPr>
+                <w:rFonts w:ascii="Times New Roman" w:cs="Times New Roman" w:eastAsia="Times New Roman" w:hAnsi="Times New Roman"/>
+                <w:b w:val="false"/>
+                <w:bCs w:val="false"/>
+                <w:color w:val="000000"/>
+                <w:sz w:val="20"/>
+                <w:szCs w:val="20"/>
+              </w:rPr>
+              <w:t xml:space="preserve">Operaciones enviadas desde el dispositivo del técnico</w:t>
+            </w:r>
+          </w:p>
+        </w:tc>
+        <w:tc>
+          <w:tcPr>
+            <w:tcW w:type="dxa" w:w="4360"/>
+            <w:tcBorders>
+              <w:top w:val="none" w:color="FFFFFF" w:sz="0"/>
+              <w:left w:val="none" w:color="FFFFFF" w:sz="0"/>
+              <w:bottom w:val="none" w:color="FFFFFF" w:sz="0"/>
+              <w:right w:val="none" w:color="FFFFFF" w:sz="0"/>
+            </w:tcBorders>
+          </w:tcPr>
+          <w:p>
+            <w:pPr>
+              <w:spacing w:after="40" w:before="40" w:line="240"/>
+            </w:pPr>
+            <w:r>
+              <w:rPr>
+                <w:rFonts w:ascii="Times New Roman" w:cs="Times New Roman" w:eastAsia="Times New Roman" w:hAnsi="Times New Roman"/>
+                <w:b w:val="false"/>
+                <w:bCs w:val="false"/>
+                <w:color w:val="000000"/>
+                <w:sz w:val="20"/>
+                <w:szCs w:val="20"/>
+              </w:rPr>
+              <w:t xml:space="preserve">Técnico, dispositivo, orden, tipo (corte, visita o reconexión), contenido, estado y motivo de conflicto</w:t>
+            </w:r>
+          </w:p>
+        </w:tc>
+      </w:tr>
+      <w:tr>
+        <w:tc>
+          <w:tcPr>
+            <w:tcW w:type="dxa" w:w="2100"/>
+            <w:tcBorders>
+              <w:top w:val="none" w:color="FFFFFF" w:sz="0"/>
+              <w:left w:val="none" w:color="FFFFFF" w:sz="0"/>
+              <w:bottom w:val="none" w:color="FFFFFF" w:sz="0"/>
+              <w:right w:val="none" w:color="FFFFFF" w:sz="0"/>
+            </w:tcBorders>
+          </w:tcPr>
+          <w:p>
+            <w:pPr>
+              <w:spacing w:after="40" w:before="40" w:line="240"/>
+            </w:pPr>
+            <w:r>
+              <w:rPr>
+                <w:rFonts w:ascii="Times New Roman" w:cs="Times New Roman" w:eastAsia="Times New Roman" w:hAnsi="Times New Roman"/>
+                <w:b w:val="false"/>
+                <w:bCs w:val="false"/>
+                <w:color w:val="000000"/>
+                <w:sz w:val="20"/>
+                <w:szCs w:val="20"/>
+              </w:rPr>
+              <w:t xml:space="preserve">Evidencias fotográficas</w:t>
+            </w:r>
+          </w:p>
+        </w:tc>
+        <w:tc>
+          <w:tcPr>
+            <w:tcW w:type="dxa" w:w="2900"/>
+            <w:tcBorders>
+              <w:top w:val="none" w:color="FFFFFF" w:sz="0"/>
+              <w:left w:val="none" w:color="FFFFFF" w:sz="0"/>
+              <w:bottom w:val="none" w:color="FFFFFF" w:sz="0"/>
+              <w:right w:val="none" w:color="FFFFFF" w:sz="0"/>
+            </w:tcBorders>
+          </w:tcPr>
+          <w:p>
+            <w:pPr>
+              <w:spacing w:after="40" w:before="40" w:line="240"/>
+            </w:pPr>
+            <w:r>
+              <w:rPr>
+                <w:rFonts w:ascii="Times New Roman" w:cs="Times New Roman" w:eastAsia="Times New Roman" w:hAnsi="Times New Roman"/>
+                <w:b w:val="false"/>
+                <w:bCs w:val="false"/>
+                <w:color w:val="000000"/>
+                <w:sz w:val="20"/>
+                <w:szCs w:val="20"/>
+              </w:rPr>
+              <w:t xml:space="preserve">Fotografías de cada corte o visita</w:t>
+            </w:r>
+          </w:p>
+        </w:tc>
+        <w:tc>
+          <w:tcPr>
+            <w:tcW w:type="dxa" w:w="4360"/>
+            <w:tcBorders>
+              <w:top w:val="none" w:color="FFFFFF" w:sz="0"/>
+              <w:left w:val="none" w:color="FFFFFF" w:sz="0"/>
+              <w:bottom w:val="none" w:color="FFFFFF" w:sz="0"/>
+              <w:right w:val="none" w:color="FFFFFF" w:sz="0"/>
+            </w:tcBorders>
+          </w:tcPr>
+          <w:p>
+            <w:pPr>
+              <w:spacing w:after="40" w:before="40" w:line="240"/>
+            </w:pPr>
+            <w:r>
+              <w:rPr>
+                <w:rFonts w:ascii="Times New Roman" w:cs="Times New Roman" w:eastAsia="Times New Roman" w:hAnsi="Times New Roman"/>
+                <w:b w:val="false"/>
+                <w:bCs w:val="false"/>
+                <w:color w:val="000000"/>
+                <w:sz w:val="20"/>
+                <w:szCs w:val="20"/>
+              </w:rPr>
+              <w:t xml:space="preserve">Orden, operación, técnico, dispositivo, tipo de imagen, huella de verificación e imagen</w:t>
+            </w:r>
+          </w:p>
+        </w:tc>
+      </w:tr>
+      <w:tr>
+        <w:tc>
+          <w:tcPr>
+            <w:tcW w:type="dxa" w:w="2100"/>
+            <w:tcBorders>
+              <w:top w:val="none" w:color="FFFFFF" w:sz="0"/>
+              <w:left w:val="none" w:color="FFFFFF" w:sz="0"/>
+              <w:bottom w:val="none" w:color="FFFFFF" w:sz="0"/>
+              <w:right w:val="none" w:color="FFFFFF" w:sz="0"/>
+            </w:tcBorders>
+          </w:tcPr>
+          <w:p>
+            <w:pPr>
+              <w:spacing w:after="40" w:before="40" w:line="240"/>
+            </w:pPr>
+            <w:r>
+              <w:rPr>
+                <w:rFonts w:ascii="Times New Roman" w:cs="Times New Roman" w:eastAsia="Times New Roman" w:hAnsi="Times New Roman"/>
+                <w:b w:val="false"/>
+                <w:bCs w:val="false"/>
+                <w:color w:val="000000"/>
+                <w:sz w:val="20"/>
+                <w:szCs w:val="20"/>
+              </w:rPr>
+              <w:t xml:space="preserve">Versiones del paquete de trabajo</w:t>
+            </w:r>
+          </w:p>
+        </w:tc>
+        <w:tc>
+          <w:tcPr>
+            <w:tcW w:type="dxa" w:w="2900"/>
+            <w:tcBorders>
+              <w:top w:val="none" w:color="FFFFFF" w:sz="0"/>
+              <w:left w:val="none" w:color="FFFFFF" w:sz="0"/>
+              <w:bottom w:val="none" w:color="FFFFFF" w:sz="0"/>
+              <w:right w:val="none" w:color="FFFFFF" w:sz="0"/>
+            </w:tcBorders>
+          </w:tcPr>
+          <w:p>
+            <w:pPr>
+              <w:spacing w:after="40" w:before="40" w:line="240"/>
+            </w:pPr>
+            <w:r>
+              <w:rPr>
+                <w:rFonts w:ascii="Times New Roman" w:cs="Times New Roman" w:eastAsia="Times New Roman" w:hAnsi="Times New Roman"/>
+                <w:b w:val="false"/>
+                <w:bCs w:val="false"/>
+                <w:color w:val="000000"/>
+                <w:sz w:val="20"/>
+                <w:szCs w:val="20"/>
+              </w:rPr>
+              <w:t xml:space="preserve">Última versión de órdenes entregada a cada técnico y dispositivo</w:t>
+            </w:r>
+          </w:p>
+        </w:tc>
+        <w:tc>
+          <w:tcPr>
+            <w:tcW w:type="dxa" w:w="4360"/>
+            <w:tcBorders>
+              <w:top w:val="none" w:color="FFFFFF" w:sz="0"/>
+              <w:left w:val="none" w:color="FFFFFF" w:sz="0"/>
+              <w:bottom w:val="none" w:color="FFFFFF" w:sz="0"/>
+              <w:right w:val="none" w:color="FFFFFF" w:sz="0"/>
+            </w:tcBorders>
+          </w:tcPr>
+          <w:p>
+            <w:pPr>
+              <w:spacing w:after="40" w:before="40" w:line="240"/>
+            </w:pPr>
+            <w:r>
+              <w:rPr>
+                <w:rFonts w:ascii="Times New Roman" w:cs="Times New Roman" w:eastAsia="Times New Roman" w:hAnsi="Times New Roman"/>
+                <w:b w:val="false"/>
+                <w:bCs w:val="false"/>
+                <w:color w:val="000000"/>
+                <w:sz w:val="20"/>
+                <w:szCs w:val="20"/>
+              </w:rPr>
+              <w:t xml:space="preserve">Técnico, dispositivo y última versión</w:t>
+            </w:r>
+          </w:p>
+        </w:tc>
+      </w:tr>
+      <w:tr>
+        <w:tc>
+          <w:tcPr>
+            <w:tcW w:type="dxa" w:w="2100"/>
+            <w:tcBorders>
+              <w:top w:val="none" w:color="FFFFFF" w:sz="0"/>
+              <w:left w:val="none" w:color="FFFFFF" w:sz="0"/>
+              <w:bottom w:val="none" w:color="FFFFFF" w:sz="0"/>
+              <w:right w:val="none" w:color="FFFFFF" w:sz="0"/>
+            </w:tcBorders>
+          </w:tcPr>
+          <w:p>
+            <w:pPr>
+              <w:spacing w:after="40" w:before="40" w:line="240"/>
+            </w:pPr>
+            <w:r>
+              <w:rPr>
+                <w:rFonts w:ascii="Times New Roman" w:cs="Times New Roman" w:eastAsia="Times New Roman" w:hAnsi="Times New Roman"/>
+                <w:b w:val="false"/>
+                <w:bCs w:val="false"/>
+                <w:color w:val="000000"/>
+                <w:sz w:val="20"/>
+                <w:szCs w:val="20"/>
+              </w:rPr>
+              <w:t xml:space="preserve">Eventos de auditoría</w:t>
+            </w:r>
+          </w:p>
+        </w:tc>
+        <w:tc>
+          <w:tcPr>
+            <w:tcW w:type="dxa" w:w="2900"/>
+            <w:tcBorders>
+              <w:top w:val="none" w:color="FFFFFF" w:sz="0"/>
+              <w:left w:val="none" w:color="FFFFFF" w:sz="0"/>
+              <w:bottom w:val="none" w:color="FFFFFF" w:sz="0"/>
+              <w:right w:val="none" w:color="FFFFFF" w:sz="0"/>
+            </w:tcBorders>
+          </w:tcPr>
+          <w:p>
+            <w:pPr>
+              <w:spacing w:after="40" w:before="40" w:line="240"/>
+            </w:pPr>
+            <w:r>
+              <w:rPr>
+                <w:rFonts w:ascii="Times New Roman" w:cs="Times New Roman" w:eastAsia="Times New Roman" w:hAnsi="Times New Roman"/>
+                <w:b w:val="false"/>
+                <w:bCs w:val="false"/>
+                <w:color w:val="000000"/>
+                <w:sz w:val="20"/>
+                <w:szCs w:val="20"/>
+              </w:rPr>
+              <w:t xml:space="preserve">Registro de las acciones del sistema</w:t>
+            </w:r>
+          </w:p>
+        </w:tc>
+        <w:tc>
+          <w:tcPr>
+            <w:tcW w:type="dxa" w:w="4360"/>
+            <w:tcBorders>
+              <w:top w:val="none" w:color="FFFFFF" w:sz="0"/>
+              <w:left w:val="none" w:color="FFFFFF" w:sz="0"/>
+              <w:bottom w:val="none" w:color="FFFFFF" w:sz="0"/>
+              <w:right w:val="none" w:color="FFFFFF" w:sz="0"/>
+            </w:tcBorders>
+          </w:tcPr>
+          <w:p>
+            <w:pPr>
+              <w:spacing w:after="40" w:before="40" w:line="240"/>
+            </w:pPr>
+            <w:r>
+              <w:rPr>
+                <w:rFonts w:ascii="Times New Roman" w:cs="Times New Roman" w:eastAsia="Times New Roman" w:hAnsi="Times New Roman"/>
+                <w:b w:val="false"/>
+                <w:bCs w:val="false"/>
+                <w:color w:val="000000"/>
+                <w:sz w:val="20"/>
+                <w:szCs w:val="20"/>
+              </w:rPr>
+              <w:t xml:space="preserve">Usuario, rol, acción, orden, resultado, motivo y fecha</w:t>
+            </w:r>
+          </w:p>
+        </w:tc>
+      </w:tr>
+      <w:tr>
+        <w:tc>
+          <w:tcPr>
+            <w:tcW w:type="dxa" w:w="2100"/>
+            <w:tcBorders>
+              <w:top w:val="none" w:color="FFFFFF" w:sz="0"/>
+              <w:left w:val="none" w:color="FFFFFF" w:sz="0"/>
+              <w:bottom w:val="single" w:color="000000" w:sz="6"/>
+              <w:right w:val="none" w:color="FFFFFF" w:sz="0"/>
+            </w:tcBorders>
+          </w:tcPr>
+          <w:p>
+            <w:pPr>
+              <w:spacing w:after="40" w:before="40" w:line="240"/>
+            </w:pPr>
+            <w:r>
+              <w:rPr>
+                <w:rFonts w:ascii="Times New Roman" w:cs="Times New Roman" w:eastAsia="Times New Roman" w:hAnsi="Times New Roman"/>
+                <w:b w:val="false"/>
+                <w:bCs w:val="false"/>
+                <w:color w:val="000000"/>
+                <w:sz w:val="20"/>
+                <w:szCs w:val="20"/>
+              </w:rPr>
+              <w:t xml:space="preserve">Observaciones de pago (legado)</w:t>
+            </w:r>
+          </w:p>
+        </w:tc>
+        <w:tc>
+          <w:tcPr>
+            <w:tcW w:type="dxa" w:w="2900"/>
+            <w:tcBorders>
+              <w:top w:val="none" w:color="FFFFFF" w:sz="0"/>
+              <w:left w:val="none" w:color="FFFFFF" w:sz="0"/>
+              <w:bottom w:val="single" w:color="000000" w:sz="6"/>
+              <w:right w:val="none" w:color="FFFFFF" w:sz="0"/>
+            </w:tcBorders>
+          </w:tcPr>
+          <w:p>
+            <w:pPr>
+              <w:spacing w:after="40" w:before="40" w:line="240"/>
+            </w:pPr>
+            <w:r>
+              <w:rPr>
+                <w:rFonts w:ascii="Times New Roman" w:cs="Times New Roman" w:eastAsia="Times New Roman" w:hAnsi="Times New Roman"/>
+                <w:b w:val="false"/>
+                <w:bCs w:val="false"/>
+                <w:color w:val="000000"/>
+                <w:sz w:val="20"/>
+                <w:szCs w:val="20"/>
+              </w:rPr>
+              <w:t xml:space="preserve">Datos heredados de pagos, sin uso en el piloto</w:t>
+            </w:r>
+          </w:p>
+        </w:tc>
+        <w:tc>
+          <w:tcPr>
+            <w:tcW w:type="dxa" w:w="4360"/>
+            <w:tcBorders>
+              <w:top w:val="none" w:color="FFFFFF" w:sz="0"/>
+              <w:left w:val="none" w:color="FFFFFF" w:sz="0"/>
+              <w:bottom w:val="single" w:color="000000" w:sz="6"/>
+              <w:right w:val="none" w:color="FFFFFF" w:sz="0"/>
+            </w:tcBorders>
+          </w:tcPr>
+          <w:p>
+            <w:pPr>
+              <w:spacing w:after="40" w:before="40" w:line="240"/>
+            </w:pPr>
+            <w:r>
+              <w:rPr>
+                <w:rFonts w:ascii="Times New Roman" w:cs="Times New Roman" w:eastAsia="Times New Roman" w:hAnsi="Times New Roman"/>
+                <w:b w:val="false"/>
+                <w:bCs w:val="false"/>
+                <w:color w:val="000000"/>
+                <w:sz w:val="20"/>
+                <w:szCs w:val="20"/>
+              </w:rPr>
+              <w:t xml:space="preserve">Operación, orden, cuenta, suministro y fecha</w:t>
+            </w:r>
+          </w:p>
+        </w:tc>
+      </w:tr>
+    </w:tbl>
+    <w:p>
+      <w:pPr>
+        <w:spacing w:after="0" w:before="0" w:line="240"/>
+      </w:pPr>
+      <w:r>
+        <w:rPr>
+          <w:rFonts w:ascii="Times New Roman" w:cs="Times New Roman" w:eastAsia="Times New Roman" w:hAnsi="Times New Roman"/>
+          <w:sz w:val="24"/>
+          <w:szCs w:val="24"/>
+        </w:rPr>
+        <w:t xml:space="preserve"/>
+      </w:r>
+    </w:p>
+    <w:p>
+      <w:pPr>
+        <w:pStyle w:val="Heading2"/>
+      </w:pPr>
+      <w:r>
+        <w:rPr>
+          <w:rFonts w:ascii="Times New Roman" w:cs="Times New Roman" w:eastAsia="Times New Roman" w:hAnsi="Times New Roman"/>
+          <w:b/>
+          <w:bCs/>
+          <w:color w:val="000000"/>
+          <w:sz w:val="24"/>
+          <w:szCs w:val="24"/>
+        </w:rPr>
+        <w:t xml:space="preserve">Documentación del Código Fuente</w:t>
       </w:r>
     </w:p>
     <w:p>
@@ -843,12 +1840,12 @@
           <w:sz w:val="24"/>
           <w:szCs w:val="24"/>
         </w:rPr>
-        <w:t xml:space="preserve">El diccionario de datos describe cada tabla y cada campo, con su nombre en español, su nombre técnico, sus valores permitidos y sus estados. Cubre las 13 tablas y 147 campos, y forma parte de la documentación técnica entregada.</w:t>
-      </w:r>
-    </w:p>
-    <w:p>
-      <w:pPr>
-        <w:pStyle w:val="Heading2"/>
+        <w:t xml:space="preserve">El código se organiza en carpetas separadas para la aplicación del técnico y del administrador, y para el servidor. Cada parte tiene una sola responsabilidad: un controlador no ejecuta consultas a la base, y solo el repositorio las ejecuta.</w:t>
+      </w:r>
+    </w:p>
+    <w:p>
+      <w:pPr>
+        <w:spacing w:after="0" w:before="0" w:line="240"/>
       </w:pPr>
       <w:r>
         <w:rPr>
@@ -859,14 +1856,944 @@
           <w:sz w:val="24"/>
           <w:szCs w:val="24"/>
         </w:rPr>
-        <w:t xml:space="preserve">Documentación del Código Fuente</w:t>
-      </w:r>
-    </w:p>
-    <w:p>
-      <w:pPr>
-        <w:spacing w:after="0" w:before="0" w:line="480" w:lineRule="auto"/>
-        <w:ind w:firstLine="720"/>
-        <w:jc w:val="left"/>
+        <w:t xml:space="preserve">Tabla 2</w:t>
+      </w:r>
+    </w:p>
+    <w:p>
+      <w:pPr>
+        <w:spacing w:after="160" w:before="0" w:line="240"/>
+      </w:pPr>
+      <w:r>
+        <w:rPr>
+          <w:rFonts w:ascii="Times New Roman" w:cs="Times New Roman" w:eastAsia="Times New Roman" w:hAnsi="Times New Roman"/>
+          <w:i/>
+          <w:iCs/>
+          <w:color w:val="000000"/>
+          <w:sz w:val="24"/>
+          <w:szCs w:val="24"/>
+        </w:rPr>
+        <w:t xml:space="preserve">Responsabilidad de los archivos principales</w:t>
+      </w:r>
+    </w:p>
+    <w:tbl>
+      <w:tblPr>
+        <w:tblW w:type="dxa" w:w="9360"/>
+        <w:tblBorders>
+          <w:top w:val="none" w:color="FFFFFF" w:sz="0"/>
+          <w:left w:val="none" w:color="FFFFFF" w:sz="0"/>
+          <w:bottom w:val="none" w:color="FFFFFF" w:sz="0"/>
+          <w:right w:val="none" w:color="FFFFFF" w:sz="0"/>
+          <w:insideH w:val="none" w:color="FFFFFF" w:sz="0"/>
+          <w:insideV w:val="none" w:color="FFFFFF" w:sz="0"/>
+        </w:tblBorders>
+      </w:tblPr>
+      <w:tblGrid>
+        <w:gridCol w:w="3400"/>
+        <w:gridCol w:w="5960"/>
+      </w:tblGrid>
+      <w:tr>
+        <w:trPr>
+          <w:tblHeader/>
+        </w:trPr>
+        <w:tc>
+          <w:tcPr>
+            <w:tcW w:type="dxa" w:w="3400"/>
+            <w:tcBorders>
+              <w:top w:val="single" w:color="000000" w:sz="6"/>
+              <w:left w:val="none" w:color="FFFFFF" w:sz="0"/>
+              <w:bottom w:val="single" w:color="000000" w:sz="6"/>
+              <w:right w:val="none" w:color="FFFFFF" w:sz="0"/>
+            </w:tcBorders>
+          </w:tcPr>
+          <w:p>
+            <w:pPr>
+              <w:spacing w:after="40" w:before="40" w:line="240"/>
+            </w:pPr>
+            <w:r>
+              <w:rPr>
+                <w:rFonts w:ascii="Times New Roman" w:cs="Times New Roman" w:eastAsia="Times New Roman" w:hAnsi="Times New Roman"/>
+                <w:b/>
+                <w:bCs/>
+                <w:color w:val="000000"/>
+                <w:sz w:val="20"/>
+                <w:szCs w:val="20"/>
+              </w:rPr>
+              <w:t xml:space="preserve">Archivo o carpeta</w:t>
+            </w:r>
+          </w:p>
+        </w:tc>
+        <w:tc>
+          <w:tcPr>
+            <w:tcW w:type="dxa" w:w="5960"/>
+            <w:tcBorders>
+              <w:top w:val="single" w:color="000000" w:sz="6"/>
+              <w:left w:val="none" w:color="FFFFFF" w:sz="0"/>
+              <w:bottom w:val="single" w:color="000000" w:sz="6"/>
+              <w:right w:val="none" w:color="FFFFFF" w:sz="0"/>
+            </w:tcBorders>
+          </w:tcPr>
+          <w:p>
+            <w:pPr>
+              <w:spacing w:after="40" w:before="40" w:line="240"/>
+            </w:pPr>
+            <w:r>
+              <w:rPr>
+                <w:rFonts w:ascii="Times New Roman" w:cs="Times New Roman" w:eastAsia="Times New Roman" w:hAnsi="Times New Roman"/>
+                <w:b/>
+                <w:bCs/>
+                <w:color w:val="000000"/>
+                <w:sz w:val="20"/>
+                <w:szCs w:val="20"/>
+              </w:rPr>
+              <w:t xml:space="preserve">Responsabilidad</w:t>
+            </w:r>
+          </w:p>
+        </w:tc>
+      </w:tr>
+      <w:tr>
+        <w:tc>
+          <w:tcPr>
+            <w:tcW w:type="dxa" w:w="3400"/>
+            <w:tcBorders>
+              <w:top w:val="none" w:color="FFFFFF" w:sz="0"/>
+              <w:left w:val="none" w:color="FFFFFF" w:sz="0"/>
+              <w:bottom w:val="none" w:color="FFFFFF" w:sz="0"/>
+              <w:right w:val="none" w:color="FFFFFF" w:sz="0"/>
+            </w:tcBorders>
+          </w:tcPr>
+          <w:p>
+            <w:pPr>
+              <w:spacing w:after="40" w:before="40" w:line="240"/>
+            </w:pPr>
+            <w:r>
+              <w:rPr>
+                <w:rFonts w:ascii="Times New Roman" w:cs="Times New Roman" w:eastAsia="Times New Roman" w:hAnsi="Times New Roman"/>
+                <w:b w:val="false"/>
+                <w:bCs w:val="false"/>
+                <w:color w:val="000000"/>
+                <w:sz w:val="20"/>
+                <w:szCs w:val="20"/>
+              </w:rPr>
+              <w:t xml:space="preserve">field-app/src/App.tsx y TechnicianRuntime.tsx</w:t>
+            </w:r>
+          </w:p>
+        </w:tc>
+        <w:tc>
+          <w:tcPr>
+            <w:tcW w:type="dxa" w:w="5960"/>
+            <w:tcBorders>
+              <w:top w:val="none" w:color="FFFFFF" w:sz="0"/>
+              <w:left w:val="none" w:color="FFFFFF" w:sz="0"/>
+              <w:bottom w:val="none" w:color="FFFFFF" w:sz="0"/>
+              <w:right w:val="none" w:color="FFFFFF" w:sz="0"/>
+            </w:tcBorders>
+          </w:tcPr>
+          <w:p>
+            <w:pPr>
+              <w:spacing w:after="40" w:before="40" w:line="240"/>
+            </w:pPr>
+            <w:r>
+              <w:rPr>
+                <w:rFonts w:ascii="Times New Roman" w:cs="Times New Roman" w:eastAsia="Times New Roman" w:hAnsi="Times New Roman"/>
+                <w:b w:val="false"/>
+                <w:bCs w:val="false"/>
+                <w:color w:val="000000"/>
+                <w:sz w:val="20"/>
+                <w:szCs w:val="20"/>
+              </w:rPr>
+              <w:t xml:space="preserve">Arranque de la aplicación, sesión y pantalla según el rol</w:t>
+            </w:r>
+          </w:p>
+        </w:tc>
+      </w:tr>
+      <w:tr>
+        <w:tc>
+          <w:tcPr>
+            <w:tcW w:type="dxa" w:w="3400"/>
+            <w:tcBorders>
+              <w:top w:val="none" w:color="FFFFFF" w:sz="0"/>
+              <w:left w:val="none" w:color="FFFFFF" w:sz="0"/>
+              <w:bottom w:val="none" w:color="FFFFFF" w:sz="0"/>
+              <w:right w:val="none" w:color="FFFFFF" w:sz="0"/>
+            </w:tcBorders>
+          </w:tcPr>
+          <w:p>
+            <w:pPr>
+              <w:spacing w:after="40" w:before="40" w:line="240"/>
+            </w:pPr>
+            <w:r>
+              <w:rPr>
+                <w:rFonts w:ascii="Times New Roman" w:cs="Times New Roman" w:eastAsia="Times New Roman" w:hAnsi="Times New Roman"/>
+                <w:b w:val="false"/>
+                <w:bCs w:val="false"/>
+                <w:color w:val="000000"/>
+                <w:sz w:val="20"/>
+                <w:szCs w:val="20"/>
+              </w:rPr>
+              <w:t xml:space="preserve">field-app/src/domain/</w:t>
+            </w:r>
+          </w:p>
+        </w:tc>
+        <w:tc>
+          <w:tcPr>
+            <w:tcW w:type="dxa" w:w="5960"/>
+            <w:tcBorders>
+              <w:top w:val="none" w:color="FFFFFF" w:sz="0"/>
+              <w:left w:val="none" w:color="FFFFFF" w:sz="0"/>
+              <w:bottom w:val="none" w:color="FFFFFF" w:sz="0"/>
+              <w:right w:val="none" w:color="FFFFFF" w:sz="0"/>
+            </w:tcBorders>
+          </w:tcPr>
+          <w:p>
+            <w:pPr>
+              <w:spacing w:after="40" w:before="40" w:line="240"/>
+            </w:pPr>
+            <w:r>
+              <w:rPr>
+                <w:rFonts w:ascii="Times New Roman" w:cs="Times New Roman" w:eastAsia="Times New Roman" w:hAnsi="Times New Roman"/>
+                <w:b w:val="false"/>
+                <w:bCs w:val="false"/>
+                <w:color w:val="000000"/>
+                <w:sz w:val="20"/>
+                <w:szCs w:val="20"/>
+              </w:rPr>
+              <w:t xml:space="preserve">Reglas de negocio para el corte, la reconexión y la visita</w:t>
+            </w:r>
+          </w:p>
+        </w:tc>
+      </w:tr>
+      <w:tr>
+        <w:tc>
+          <w:tcPr>
+            <w:tcW w:type="dxa" w:w="3400"/>
+            <w:tcBorders>
+              <w:top w:val="none" w:color="FFFFFF" w:sz="0"/>
+              <w:left w:val="none" w:color="FFFFFF" w:sz="0"/>
+              <w:bottom w:val="none" w:color="FFFFFF" w:sz="0"/>
+              <w:right w:val="none" w:color="FFFFFF" w:sz="0"/>
+            </w:tcBorders>
+          </w:tcPr>
+          <w:p>
+            <w:pPr>
+              <w:spacing w:after="40" w:before="40" w:line="240"/>
+            </w:pPr>
+            <w:r>
+              <w:rPr>
+                <w:rFonts w:ascii="Times New Roman" w:cs="Times New Roman" w:eastAsia="Times New Roman" w:hAnsi="Times New Roman"/>
+                <w:b w:val="false"/>
+                <w:bCs w:val="false"/>
+                <w:color w:val="000000"/>
+                <w:sz w:val="20"/>
+                <w:szCs w:val="20"/>
+              </w:rPr>
+              <w:t xml:space="preserve">field-app/src/use-cases/</w:t>
+            </w:r>
+          </w:p>
+        </w:tc>
+        <w:tc>
+          <w:tcPr>
+            <w:tcW w:type="dxa" w:w="5960"/>
+            <w:tcBorders>
+              <w:top w:val="none" w:color="FFFFFF" w:sz="0"/>
+              <w:left w:val="none" w:color="FFFFFF" w:sz="0"/>
+              <w:bottom w:val="none" w:color="FFFFFF" w:sz="0"/>
+              <w:right w:val="none" w:color="FFFFFF" w:sz="0"/>
+            </w:tcBorders>
+          </w:tcPr>
+          <w:p>
+            <w:pPr>
+              <w:spacing w:after="40" w:before="40" w:line="240"/>
+            </w:pPr>
+            <w:r>
+              <w:rPr>
+                <w:rFonts w:ascii="Times New Roman" w:cs="Times New Roman" w:eastAsia="Times New Roman" w:hAnsi="Times New Roman"/>
+                <w:b w:val="false"/>
+                <w:bCs w:val="false"/>
+                <w:color w:val="000000"/>
+                <w:sz w:val="20"/>
+                <w:szCs w:val="20"/>
+              </w:rPr>
+              <w:t xml:space="preserve">Acciones del técnico y del administrador: corte, reconexión, visita, sincronización, descarga y administración</w:t>
+            </w:r>
+          </w:p>
+        </w:tc>
+      </w:tr>
+      <w:tr>
+        <w:tc>
+          <w:tcPr>
+            <w:tcW w:type="dxa" w:w="3400"/>
+            <w:tcBorders>
+              <w:top w:val="none" w:color="FFFFFF" w:sz="0"/>
+              <w:left w:val="none" w:color="FFFFFF" w:sz="0"/>
+              <w:bottom w:val="none" w:color="FFFFFF" w:sz="0"/>
+              <w:right w:val="none" w:color="FFFFFF" w:sz="0"/>
+            </w:tcBorders>
+          </w:tcPr>
+          <w:p>
+            <w:pPr>
+              <w:spacing w:after="40" w:before="40" w:line="240"/>
+            </w:pPr>
+            <w:r>
+              <w:rPr>
+                <w:rFonts w:ascii="Times New Roman" w:cs="Times New Roman" w:eastAsia="Times New Roman" w:hAnsi="Times New Roman"/>
+                <w:b w:val="false"/>
+                <w:bCs w:val="false"/>
+                <w:color w:val="000000"/>
+                <w:sz w:val="20"/>
+                <w:szCs w:val="20"/>
+              </w:rPr>
+              <w:t xml:space="preserve">field-app/src/ports/</w:t>
+            </w:r>
+          </w:p>
+        </w:tc>
+        <w:tc>
+          <w:tcPr>
+            <w:tcW w:type="dxa" w:w="5960"/>
+            <w:tcBorders>
+              <w:top w:val="none" w:color="FFFFFF" w:sz="0"/>
+              <w:left w:val="none" w:color="FFFFFF" w:sz="0"/>
+              <w:bottom w:val="none" w:color="FFFFFF" w:sz="0"/>
+              <w:right w:val="none" w:color="FFFFFF" w:sz="0"/>
+            </w:tcBorders>
+          </w:tcPr>
+          <w:p>
+            <w:pPr>
+              <w:spacing w:after="40" w:before="40" w:line="240"/>
+            </w:pPr>
+            <w:r>
+              <w:rPr>
+                <w:rFonts w:ascii="Times New Roman" w:cs="Times New Roman" w:eastAsia="Times New Roman" w:hAnsi="Times New Roman"/>
+                <w:b w:val="false"/>
+                <w:bCs w:val="false"/>
+                <w:color w:val="000000"/>
+                <w:sz w:val="20"/>
+                <w:szCs w:val="20"/>
+              </w:rPr>
+              <w:t xml:space="preserve">Contratos que la aplicación necesita del almacenamiento, del servidor y de la conexión</w:t>
+            </w:r>
+          </w:p>
+        </w:tc>
+      </w:tr>
+      <w:tr>
+        <w:tc>
+          <w:tcPr>
+            <w:tcW w:type="dxa" w:w="3400"/>
+            <w:tcBorders>
+              <w:top w:val="none" w:color="FFFFFF" w:sz="0"/>
+              <w:left w:val="none" w:color="FFFFFF" w:sz="0"/>
+              <w:bottom w:val="none" w:color="FFFFFF" w:sz="0"/>
+              <w:right w:val="none" w:color="FFFFFF" w:sz="0"/>
+            </w:tcBorders>
+          </w:tcPr>
+          <w:p>
+            <w:pPr>
+              <w:spacing w:after="40" w:before="40" w:line="240"/>
+            </w:pPr>
+            <w:r>
+              <w:rPr>
+                <w:rFonts w:ascii="Times New Roman" w:cs="Times New Roman" w:eastAsia="Times New Roman" w:hAnsi="Times New Roman"/>
+                <w:b w:val="false"/>
+                <w:bCs w:val="false"/>
+                <w:color w:val="000000"/>
+                <w:sz w:val="20"/>
+                <w:szCs w:val="20"/>
+              </w:rPr>
+              <w:t xml:space="preserve">field-app/src/adapters/indexeddb/</w:t>
+            </w:r>
+          </w:p>
+        </w:tc>
+        <w:tc>
+          <w:tcPr>
+            <w:tcW w:type="dxa" w:w="5960"/>
+            <w:tcBorders>
+              <w:top w:val="none" w:color="FFFFFF" w:sz="0"/>
+              <w:left w:val="none" w:color="FFFFFF" w:sz="0"/>
+              <w:bottom w:val="none" w:color="FFFFFF" w:sz="0"/>
+              <w:right w:val="none" w:color="FFFFFF" w:sz="0"/>
+            </w:tcBorders>
+          </w:tcPr>
+          <w:p>
+            <w:pPr>
+              <w:spacing w:after="40" w:before="40" w:line="240"/>
+            </w:pPr>
+            <w:r>
+              <w:rPr>
+                <w:rFonts w:ascii="Times New Roman" w:cs="Times New Roman" w:eastAsia="Times New Roman" w:hAnsi="Times New Roman"/>
+                <w:b w:val="false"/>
+                <w:bCs w:val="false"/>
+                <w:color w:val="000000"/>
+                <w:sz w:val="20"/>
+                <w:szCs w:val="20"/>
+              </w:rPr>
+              <w:t xml:space="preserve">Guardado local en el dispositivo: órdenes, operaciones, cola y fotos</w:t>
+            </w:r>
+          </w:p>
+        </w:tc>
+      </w:tr>
+      <w:tr>
+        <w:tc>
+          <w:tcPr>
+            <w:tcW w:type="dxa" w:w="3400"/>
+            <w:tcBorders>
+              <w:top w:val="none" w:color="FFFFFF" w:sz="0"/>
+              <w:left w:val="none" w:color="FFFFFF" w:sz="0"/>
+              <w:bottom w:val="none" w:color="FFFFFF" w:sz="0"/>
+              <w:right w:val="none" w:color="FFFFFF" w:sz="0"/>
+            </w:tcBorders>
+          </w:tcPr>
+          <w:p>
+            <w:pPr>
+              <w:spacing w:after="40" w:before="40" w:line="240"/>
+            </w:pPr>
+            <w:r>
+              <w:rPr>
+                <w:rFonts w:ascii="Times New Roman" w:cs="Times New Roman" w:eastAsia="Times New Roman" w:hAnsi="Times New Roman"/>
+                <w:b w:val="false"/>
+                <w:bCs w:val="false"/>
+                <w:color w:val="000000"/>
+                <w:sz w:val="20"/>
+                <w:szCs w:val="20"/>
+              </w:rPr>
+              <w:t xml:space="preserve">field-app/src/adapters/http/</w:t>
+            </w:r>
+          </w:p>
+        </w:tc>
+        <w:tc>
+          <w:tcPr>
+            <w:tcW w:type="dxa" w:w="5960"/>
+            <w:tcBorders>
+              <w:top w:val="none" w:color="FFFFFF" w:sz="0"/>
+              <w:left w:val="none" w:color="FFFFFF" w:sz="0"/>
+              <w:bottom w:val="none" w:color="FFFFFF" w:sz="0"/>
+              <w:right w:val="none" w:color="FFFFFF" w:sz="0"/>
+            </w:tcBorders>
+          </w:tcPr>
+          <w:p>
+            <w:pPr>
+              <w:spacing w:after="40" w:before="40" w:line="240"/>
+            </w:pPr>
+            <w:r>
+              <w:rPr>
+                <w:rFonts w:ascii="Times New Roman" w:cs="Times New Roman" w:eastAsia="Times New Roman" w:hAnsi="Times New Roman"/>
+                <w:b w:val="false"/>
+                <w:bCs w:val="false"/>
+                <w:color w:val="000000"/>
+                <w:sz w:val="20"/>
+                <w:szCs w:val="20"/>
+              </w:rPr>
+              <w:t xml:space="preserve">Comunicación con el servidor</w:t>
+            </w:r>
+          </w:p>
+        </w:tc>
+      </w:tr>
+      <w:tr>
+        <w:tc>
+          <w:tcPr>
+            <w:tcW w:type="dxa" w:w="3400"/>
+            <w:tcBorders>
+              <w:top w:val="none" w:color="FFFFFF" w:sz="0"/>
+              <w:left w:val="none" w:color="FFFFFF" w:sz="0"/>
+              <w:bottom w:val="none" w:color="FFFFFF" w:sz="0"/>
+              <w:right w:val="none" w:color="FFFFFF" w:sz="0"/>
+            </w:tcBorders>
+          </w:tcPr>
+          <w:p>
+            <w:pPr>
+              <w:spacing w:after="40" w:before="40" w:line="240"/>
+            </w:pPr>
+            <w:r>
+              <w:rPr>
+                <w:rFonts w:ascii="Times New Roman" w:cs="Times New Roman" w:eastAsia="Times New Roman" w:hAnsi="Times New Roman"/>
+                <w:b w:val="false"/>
+                <w:bCs w:val="false"/>
+                <w:color w:val="000000"/>
+                <w:sz w:val="20"/>
+                <w:szCs w:val="20"/>
+              </w:rPr>
+              <w:t xml:space="preserve">field-app/src/state/</w:t>
+            </w:r>
+          </w:p>
+        </w:tc>
+        <w:tc>
+          <w:tcPr>
+            <w:tcW w:type="dxa" w:w="5960"/>
+            <w:tcBorders>
+              <w:top w:val="none" w:color="FFFFFF" w:sz="0"/>
+              <w:left w:val="none" w:color="FFFFFF" w:sz="0"/>
+              <w:bottom w:val="none" w:color="FFFFFF" w:sz="0"/>
+              <w:right w:val="none" w:color="FFFFFF" w:sz="0"/>
+            </w:tcBorders>
+          </w:tcPr>
+          <w:p>
+            <w:pPr>
+              <w:spacing w:after="40" w:before="40" w:line="240"/>
+            </w:pPr>
+            <w:r>
+              <w:rPr>
+                <w:rFonts w:ascii="Times New Roman" w:cs="Times New Roman" w:eastAsia="Times New Roman" w:hAnsi="Times New Roman"/>
+                <w:b w:val="false"/>
+                <w:bCs w:val="false"/>
+                <w:color w:val="000000"/>
+                <w:sz w:val="20"/>
+                <w:szCs w:val="20"/>
+              </w:rPr>
+              <w:t xml:space="preserve">Estado de la jornada que se muestra en pantalla</w:t>
+            </w:r>
+          </w:p>
+        </w:tc>
+      </w:tr>
+      <w:tr>
+        <w:tc>
+          <w:tcPr>
+            <w:tcW w:type="dxa" w:w="3400"/>
+            <w:tcBorders>
+              <w:top w:val="none" w:color="FFFFFF" w:sz="0"/>
+              <w:left w:val="none" w:color="FFFFFF" w:sz="0"/>
+              <w:bottom w:val="none" w:color="FFFFFF" w:sz="0"/>
+              <w:right w:val="none" w:color="FFFFFF" w:sz="0"/>
+            </w:tcBorders>
+          </w:tcPr>
+          <w:p>
+            <w:pPr>
+              <w:spacing w:after="40" w:before="40" w:line="240"/>
+            </w:pPr>
+            <w:r>
+              <w:rPr>
+                <w:rFonts w:ascii="Times New Roman" w:cs="Times New Roman" w:eastAsia="Times New Roman" w:hAnsi="Times New Roman"/>
+                <w:b w:val="false"/>
+                <w:bCs w:val="false"/>
+                <w:color w:val="000000"/>
+                <w:sz w:val="20"/>
+                <w:szCs w:val="20"/>
+              </w:rPr>
+              <w:t xml:space="preserve">backend/src/server.ts</w:t>
+            </w:r>
+          </w:p>
+        </w:tc>
+        <w:tc>
+          <w:tcPr>
+            <w:tcW w:type="dxa" w:w="5960"/>
+            <w:tcBorders>
+              <w:top w:val="none" w:color="FFFFFF" w:sz="0"/>
+              <w:left w:val="none" w:color="FFFFFF" w:sz="0"/>
+              <w:bottom w:val="none" w:color="FFFFFF" w:sz="0"/>
+              <w:right w:val="none" w:color="FFFFFF" w:sz="0"/>
+            </w:tcBorders>
+          </w:tcPr>
+          <w:p>
+            <w:pPr>
+              <w:spacing w:after="40" w:before="40" w:line="240"/>
+            </w:pPr>
+            <w:r>
+              <w:rPr>
+                <w:rFonts w:ascii="Times New Roman" w:cs="Times New Roman" w:eastAsia="Times New Roman" w:hAnsi="Times New Roman"/>
+                <w:b w:val="false"/>
+                <w:bCs w:val="false"/>
+                <w:color w:val="000000"/>
+                <w:sz w:val="20"/>
+                <w:szCs w:val="20"/>
+              </w:rPr>
+              <w:t xml:space="preserve">Arranque del servidor, configuración y conexión a la base</w:t>
+            </w:r>
+          </w:p>
+        </w:tc>
+      </w:tr>
+      <w:tr>
+        <w:tc>
+          <w:tcPr>
+            <w:tcW w:type="dxa" w:w="3400"/>
+            <w:tcBorders>
+              <w:top w:val="none" w:color="FFFFFF" w:sz="0"/>
+              <w:left w:val="none" w:color="FFFFFF" w:sz="0"/>
+              <w:bottom w:val="none" w:color="FFFFFF" w:sz="0"/>
+              <w:right w:val="none" w:color="FFFFFF" w:sz="0"/>
+            </w:tcBorders>
+          </w:tcPr>
+          <w:p>
+            <w:pPr>
+              <w:spacing w:after="40" w:before="40" w:line="240"/>
+            </w:pPr>
+            <w:r>
+              <w:rPr>
+                <w:rFonts w:ascii="Times New Roman" w:cs="Times New Roman" w:eastAsia="Times New Roman" w:hAnsi="Times New Roman"/>
+                <w:b w:val="false"/>
+                <w:bCs w:val="false"/>
+                <w:color w:val="000000"/>
+                <w:sz w:val="20"/>
+                <w:szCs w:val="20"/>
+              </w:rPr>
+              <w:t xml:space="preserve">backend/src/http/</w:t>
+            </w:r>
+          </w:p>
+        </w:tc>
+        <w:tc>
+          <w:tcPr>
+            <w:tcW w:type="dxa" w:w="5960"/>
+            <w:tcBorders>
+              <w:top w:val="none" w:color="FFFFFF" w:sz="0"/>
+              <w:left w:val="none" w:color="FFFFFF" w:sz="0"/>
+              <w:bottom w:val="none" w:color="FFFFFF" w:sz="0"/>
+              <w:right w:val="none" w:color="FFFFFF" w:sz="0"/>
+            </w:tcBorders>
+          </w:tcPr>
+          <w:p>
+            <w:pPr>
+              <w:spacing w:after="40" w:before="40" w:line="240"/>
+            </w:pPr>
+            <w:r>
+              <w:rPr>
+                <w:rFonts w:ascii="Times New Roman" w:cs="Times New Roman" w:eastAsia="Times New Roman" w:hAnsi="Times New Roman"/>
+                <w:b w:val="false"/>
+                <w:bCs w:val="false"/>
+                <w:color w:val="000000"/>
+                <w:sz w:val="20"/>
+                <w:szCs w:val="20"/>
+              </w:rPr>
+              <w:t xml:space="preserve">Cabeceras, sesión, errores y la lista de rutas</w:t>
+            </w:r>
+          </w:p>
+        </w:tc>
+      </w:tr>
+      <w:tr>
+        <w:tc>
+          <w:tcPr>
+            <w:tcW w:type="dxa" w:w="3400"/>
+            <w:tcBorders>
+              <w:top w:val="none" w:color="FFFFFF" w:sz="0"/>
+              <w:left w:val="none" w:color="FFFFFF" w:sz="0"/>
+              <w:bottom w:val="none" w:color="FFFFFF" w:sz="0"/>
+              <w:right w:val="none" w:color="FFFFFF" w:sz="0"/>
+            </w:tcBorders>
+          </w:tcPr>
+          <w:p>
+            <w:pPr>
+              <w:spacing w:after="40" w:before="40" w:line="240"/>
+            </w:pPr>
+            <w:r>
+              <w:rPr>
+                <w:rFonts w:ascii="Times New Roman" w:cs="Times New Roman" w:eastAsia="Times New Roman" w:hAnsi="Times New Roman"/>
+                <w:b w:val="false"/>
+                <w:bCs w:val="false"/>
+                <w:color w:val="000000"/>
+                <w:sz w:val="20"/>
+                <w:szCs w:val="20"/>
+              </w:rPr>
+              <w:t xml:space="preserve">backend/src/controllers/</w:t>
+            </w:r>
+          </w:p>
+        </w:tc>
+        <w:tc>
+          <w:tcPr>
+            <w:tcW w:type="dxa" w:w="5960"/>
+            <w:tcBorders>
+              <w:top w:val="none" w:color="FFFFFF" w:sz="0"/>
+              <w:left w:val="none" w:color="FFFFFF" w:sz="0"/>
+              <w:bottom w:val="none" w:color="FFFFFF" w:sz="0"/>
+              <w:right w:val="none" w:color="FFFFFF" w:sz="0"/>
+            </w:tcBorders>
+          </w:tcPr>
+          <w:p>
+            <w:pPr>
+              <w:spacing w:after="40" w:before="40" w:line="240"/>
+            </w:pPr>
+            <w:r>
+              <w:rPr>
+                <w:rFonts w:ascii="Times New Roman" w:cs="Times New Roman" w:eastAsia="Times New Roman" w:hAnsi="Times New Roman"/>
+                <w:b w:val="false"/>
+                <w:bCs w:val="false"/>
+                <w:color w:val="000000"/>
+                <w:sz w:val="20"/>
+                <w:szCs w:val="20"/>
+              </w:rPr>
+              <w:t xml:space="preserve">Recibe cada solicitud, valida el rol y la forma de los datos; no ejecuta consultas</w:t>
+            </w:r>
+          </w:p>
+        </w:tc>
+      </w:tr>
+      <w:tr>
+        <w:tc>
+          <w:tcPr>
+            <w:tcW w:type="dxa" w:w="3400"/>
+            <w:tcBorders>
+              <w:top w:val="none" w:color="FFFFFF" w:sz="0"/>
+              <w:left w:val="none" w:color="FFFFFF" w:sz="0"/>
+              <w:bottom w:val="none" w:color="FFFFFF" w:sz="0"/>
+              <w:right w:val="none" w:color="FFFFFF" w:sz="0"/>
+            </w:tcBorders>
+          </w:tcPr>
+          <w:p>
+            <w:pPr>
+              <w:spacing w:after="40" w:before="40" w:line="240"/>
+            </w:pPr>
+            <w:r>
+              <w:rPr>
+                <w:rFonts w:ascii="Times New Roman" w:cs="Times New Roman" w:eastAsia="Times New Roman" w:hAnsi="Times New Roman"/>
+                <w:b w:val="false"/>
+                <w:bCs w:val="false"/>
+                <w:color w:val="000000"/>
+                <w:sz w:val="20"/>
+                <w:szCs w:val="20"/>
+              </w:rPr>
+              <w:t xml:space="preserve">backend/src/services/</w:t>
+            </w:r>
+          </w:p>
+        </w:tc>
+        <w:tc>
+          <w:tcPr>
+            <w:tcW w:type="dxa" w:w="5960"/>
+            <w:tcBorders>
+              <w:top w:val="none" w:color="FFFFFF" w:sz="0"/>
+              <w:left w:val="none" w:color="FFFFFF" w:sz="0"/>
+              <w:bottom w:val="none" w:color="FFFFFF" w:sz="0"/>
+              <w:right w:val="none" w:color="FFFFFF" w:sz="0"/>
+            </w:tcBorders>
+          </w:tcPr>
+          <w:p>
+            <w:pPr>
+              <w:spacing w:after="40" w:before="40" w:line="240"/>
+            </w:pPr>
+            <w:r>
+              <w:rPr>
+                <w:rFonts w:ascii="Times New Roman" w:cs="Times New Roman" w:eastAsia="Times New Roman" w:hAnsi="Times New Roman"/>
+                <w:b w:val="false"/>
+                <w:bCs w:val="false"/>
+                <w:color w:val="000000"/>
+                <w:sz w:val="20"/>
+                <w:szCs w:val="20"/>
+              </w:rPr>
+              <w:t xml:space="preserve">Reglas de negocio: duplicados, versiones, autorizaciones, sincronización y auditoría</w:t>
+            </w:r>
+          </w:p>
+        </w:tc>
+      </w:tr>
+      <w:tr>
+        <w:tc>
+          <w:tcPr>
+            <w:tcW w:type="dxa" w:w="3400"/>
+            <w:tcBorders>
+              <w:top w:val="none" w:color="FFFFFF" w:sz="0"/>
+              <w:left w:val="none" w:color="FFFFFF" w:sz="0"/>
+              <w:bottom w:val="none" w:color="FFFFFF" w:sz="0"/>
+              <w:right w:val="none" w:color="FFFFFF" w:sz="0"/>
+            </w:tcBorders>
+          </w:tcPr>
+          <w:p>
+            <w:pPr>
+              <w:spacing w:after="40" w:before="40" w:line="240"/>
+            </w:pPr>
+            <w:r>
+              <w:rPr>
+                <w:rFonts w:ascii="Times New Roman" w:cs="Times New Roman" w:eastAsia="Times New Roman" w:hAnsi="Times New Roman"/>
+                <w:b w:val="false"/>
+                <w:bCs w:val="false"/>
+                <w:color w:val="000000"/>
+                <w:sz w:val="20"/>
+                <w:szCs w:val="20"/>
+              </w:rPr>
+              <w:t xml:space="preserve">backend/src/repositories/</w:t>
+            </w:r>
+          </w:p>
+        </w:tc>
+        <w:tc>
+          <w:tcPr>
+            <w:tcW w:type="dxa" w:w="5960"/>
+            <w:tcBorders>
+              <w:top w:val="none" w:color="FFFFFF" w:sz="0"/>
+              <w:left w:val="none" w:color="FFFFFF" w:sz="0"/>
+              <w:bottom w:val="none" w:color="FFFFFF" w:sz="0"/>
+              <w:right w:val="none" w:color="FFFFFF" w:sz="0"/>
+            </w:tcBorders>
+          </w:tcPr>
+          <w:p>
+            <w:pPr>
+              <w:spacing w:after="40" w:before="40" w:line="240"/>
+            </w:pPr>
+            <w:r>
+              <w:rPr>
+                <w:rFonts w:ascii="Times New Roman" w:cs="Times New Roman" w:eastAsia="Times New Roman" w:hAnsi="Times New Roman"/>
+                <w:b w:val="false"/>
+                <w:bCs w:val="false"/>
+                <w:color w:val="000000"/>
+                <w:sz w:val="20"/>
+                <w:szCs w:val="20"/>
+              </w:rPr>
+              <w:t xml:space="preserve">Consultas SQL a la base de datos</w:t>
+            </w:r>
+          </w:p>
+        </w:tc>
+      </w:tr>
+      <w:tr>
+        <w:tc>
+          <w:tcPr>
+            <w:tcW w:type="dxa" w:w="3400"/>
+            <w:tcBorders>
+              <w:top w:val="none" w:color="FFFFFF" w:sz="0"/>
+              <w:left w:val="none" w:color="FFFFFF" w:sz="0"/>
+              <w:bottom w:val="none" w:color="FFFFFF" w:sz="0"/>
+              <w:right w:val="none" w:color="FFFFFF" w:sz="0"/>
+            </w:tcBorders>
+          </w:tcPr>
+          <w:p>
+            <w:pPr>
+              <w:spacing w:after="40" w:before="40" w:line="240"/>
+            </w:pPr>
+            <w:r>
+              <w:rPr>
+                <w:rFonts w:ascii="Times New Roman" w:cs="Times New Roman" w:eastAsia="Times New Roman" w:hAnsi="Times New Roman"/>
+                <w:b w:val="false"/>
+                <w:bCs w:val="false"/>
+                <w:color w:val="000000"/>
+                <w:sz w:val="20"/>
+                <w:szCs w:val="20"/>
+              </w:rPr>
+              <w:t xml:space="preserve">backend/sql/</w:t>
+            </w:r>
+          </w:p>
+        </w:tc>
+        <w:tc>
+          <w:tcPr>
+            <w:tcW w:type="dxa" w:w="5960"/>
+            <w:tcBorders>
+              <w:top w:val="none" w:color="FFFFFF" w:sz="0"/>
+              <w:left w:val="none" w:color="FFFFFF" w:sz="0"/>
+              <w:bottom w:val="none" w:color="FFFFFF" w:sz="0"/>
+              <w:right w:val="none" w:color="FFFFFF" w:sz="0"/>
+            </w:tcBorders>
+          </w:tcPr>
+          <w:p>
+            <w:pPr>
+              <w:spacing w:after="40" w:before="40" w:line="240"/>
+            </w:pPr>
+            <w:r>
+              <w:rPr>
+                <w:rFonts w:ascii="Times New Roman" w:cs="Times New Roman" w:eastAsia="Times New Roman" w:hAnsi="Times New Roman"/>
+                <w:b w:val="false"/>
+                <w:bCs w:val="false"/>
+                <w:color w:val="000000"/>
+                <w:sz w:val="20"/>
+                <w:szCs w:val="20"/>
+              </w:rPr>
+              <w:t xml:space="preserve">Migraciones del esquema (001 a 008) y datos de prueba</w:t>
+            </w:r>
+          </w:p>
+        </w:tc>
+      </w:tr>
+      <w:tr>
+        <w:tc>
+          <w:tcPr>
+            <w:tcW w:type="dxa" w:w="3400"/>
+            <w:tcBorders>
+              <w:top w:val="none" w:color="FFFFFF" w:sz="0"/>
+              <w:left w:val="none" w:color="FFFFFF" w:sz="0"/>
+              <w:bottom w:val="none" w:color="FFFFFF" w:sz="0"/>
+              <w:right w:val="none" w:color="FFFFFF" w:sz="0"/>
+            </w:tcBorders>
+          </w:tcPr>
+          <w:p>
+            <w:pPr>
+              <w:spacing w:after="40" w:before="40" w:line="240"/>
+            </w:pPr>
+            <w:r>
+              <w:rPr>
+                <w:rFonts w:ascii="Times New Roman" w:cs="Times New Roman" w:eastAsia="Times New Roman" w:hAnsi="Times New Roman"/>
+                <w:b w:val="false"/>
+                <w:bCs w:val="false"/>
+                <w:color w:val="000000"/>
+                <w:sz w:val="20"/>
+                <w:szCs w:val="20"/>
+              </w:rPr>
+              <w:t xml:space="preserve">backend/openapi/</w:t>
+            </w:r>
+          </w:p>
+        </w:tc>
+        <w:tc>
+          <w:tcPr>
+            <w:tcW w:type="dxa" w:w="5960"/>
+            <w:tcBorders>
+              <w:top w:val="none" w:color="FFFFFF" w:sz="0"/>
+              <w:left w:val="none" w:color="FFFFFF" w:sz="0"/>
+              <w:bottom w:val="none" w:color="FFFFFF" w:sz="0"/>
+              <w:right w:val="none" w:color="FFFFFF" w:sz="0"/>
+            </w:tcBorders>
+          </w:tcPr>
+          <w:p>
+            <w:pPr>
+              <w:spacing w:after="40" w:before="40" w:line="240"/>
+            </w:pPr>
+            <w:r>
+              <w:rPr>
+                <w:rFonts w:ascii="Times New Roman" w:cs="Times New Roman" w:eastAsia="Times New Roman" w:hAnsi="Times New Roman"/>
+                <w:b w:val="false"/>
+                <w:bCs w:val="false"/>
+                <w:color w:val="000000"/>
+                <w:sz w:val="20"/>
+                <w:szCs w:val="20"/>
+              </w:rPr>
+              <w:t xml:space="preserve">Descripción formal de las rutas del servidor</w:t>
+            </w:r>
+          </w:p>
+        </w:tc>
+      </w:tr>
+      <w:tr>
+        <w:tc>
+          <w:tcPr>
+            <w:tcW w:type="dxa" w:w="3400"/>
+            <w:tcBorders>
+              <w:top w:val="none" w:color="FFFFFF" w:sz="0"/>
+              <w:left w:val="none" w:color="FFFFFF" w:sz="0"/>
+              <w:bottom w:val="single" w:color="000000" w:sz="6"/>
+              <w:right w:val="none" w:color="FFFFFF" w:sz="0"/>
+            </w:tcBorders>
+          </w:tcPr>
+          <w:p>
+            <w:pPr>
+              <w:spacing w:after="40" w:before="40" w:line="240"/>
+            </w:pPr>
+            <w:r>
+              <w:rPr>
+                <w:rFonts w:ascii="Times New Roman" w:cs="Times New Roman" w:eastAsia="Times New Roman" w:hAnsi="Times New Roman"/>
+                <w:b w:val="false"/>
+                <w:bCs w:val="false"/>
+                <w:color w:val="000000"/>
+                <w:sz w:val="20"/>
+                <w:szCs w:val="20"/>
+              </w:rPr>
+              <w:t xml:space="preserve">.github/workflows/ci.yml</w:t>
+            </w:r>
+          </w:p>
+        </w:tc>
+        <w:tc>
+          <w:tcPr>
+            <w:tcW w:type="dxa" w:w="5960"/>
+            <w:tcBorders>
+              <w:top w:val="none" w:color="FFFFFF" w:sz="0"/>
+              <w:left w:val="none" w:color="FFFFFF" w:sz="0"/>
+              <w:bottom w:val="single" w:color="000000" w:sz="6"/>
+              <w:right w:val="none" w:color="FFFFFF" w:sz="0"/>
+            </w:tcBorders>
+          </w:tcPr>
+          <w:p>
+            <w:pPr>
+              <w:spacing w:after="40" w:before="40" w:line="240"/>
+            </w:pPr>
+            <w:r>
+              <w:rPr>
+                <w:rFonts w:ascii="Times New Roman" w:cs="Times New Roman" w:eastAsia="Times New Roman" w:hAnsi="Times New Roman"/>
+                <w:b w:val="false"/>
+                <w:bCs w:val="false"/>
+                <w:color w:val="000000"/>
+                <w:sz w:val="20"/>
+                <w:szCs w:val="20"/>
+              </w:rPr>
+              <w:t xml:space="preserve">Ejecuta las pruebas automáticamente</w:t>
+            </w:r>
+          </w:p>
+        </w:tc>
+      </w:tr>
+    </w:tbl>
+    <w:p>
+      <w:pPr>
+        <w:spacing w:after="0" w:before="0" w:line="240"/>
         <w:sectPr>
           <w:headerReference w:type="default" r:id="rId6"/>
           <w:pgSz w:w="12240" w:h="15840" w:orient="portrait"/>
@@ -878,11 +2805,10 @@
       <w:r>
         <w:rPr>
           <w:rFonts w:ascii="Times New Roman" w:cs="Times New Roman" w:eastAsia="Times New Roman" w:hAnsi="Times New Roman"/>
-          <w:color w:val="000000"/>
-          <w:sz w:val="24"/>
-          <w:szCs w:val="24"/>
-        </w:rPr>
-        <w:t xml:space="preserve">El código se organiza en carpetas separadas para la aplicación, el servidor, las migraciones de la base de datos y la descripción de las rutas del servidor. En el servidor, la atención de solicitudes, las reglas de negocio y el acceso a la base están separados, de modo que las reglas no dependen de la pantalla. El servidor tiene 24 rutas, y su descripción coincide con el código.</w:t>
+          <w:sz w:val="24"/>
+          <w:szCs w:val="24"/>
+        </w:rPr>
+        <w:t xml:space="preserve"/>
       </w:r>
     </w:p>
     <w:p>
@@ -1153,7 +3079,7 @@
         <w:pStyle w:val="ListParagraph"/>
         <w:numPr>
           <w:ilvl w:val="0"/>
-          <w:numId w:val="5"/>
+          <w:numId w:val="4"/>
         </w:numPr>
         <w:spacing w:after="0" w:before="0" w:line="480" w:lineRule="auto"/>
       </w:pPr>
@@ -1165,6 +3091,61 @@
           <w:szCs w:val="24"/>
         </w:rPr>
         <w:t xml:space="preserve">Abra SEPSA Campo y pulse Enviar pendientes y actualizar para descargar sus órdenes (Figura 2).</w:t>
+      </w:r>
+    </w:p>
+    <w:p>
+      <w:pPr>
+        <w:pStyle w:val="ListParagraph"/>
+        <w:numPr>
+          <w:ilvl w:val="0"/>
+          <w:numId w:val="4"/>
+        </w:numPr>
+        <w:spacing w:after="0" w:before="0" w:line="480" w:lineRule="auto"/>
+      </w:pPr>
+      <w:r>
+        <w:rPr>
+          <w:rFonts w:ascii="Times New Roman" w:cs="Times New Roman" w:eastAsia="Times New Roman" w:hAnsi="Times New Roman"/>
+          <w:color w:val="000000"/>
+          <w:sz w:val="24"/>
+          <w:szCs w:val="24"/>
+        </w:rPr>
+        <w:t xml:space="preserve">Revise que la parte superior de la pantalla diga Red disponible.</w:t>
+      </w:r>
+    </w:p>
+    <w:p>
+      <w:pPr>
+        <w:pStyle w:val="ListParagraph"/>
+        <w:numPr>
+          <w:ilvl w:val="0"/>
+          <w:numId w:val="4"/>
+        </w:numPr>
+        <w:spacing w:after="0" w:before="0" w:line="480" w:lineRule="auto"/>
+      </w:pPr>
+      <w:r>
+        <w:rPr>
+          <w:rFonts w:ascii="Times New Roman" w:cs="Times New Roman" w:eastAsia="Times New Roman" w:hAnsi="Times New Roman"/>
+          <w:color w:val="000000"/>
+          <w:sz w:val="24"/>
+          <w:szCs w:val="24"/>
+        </w:rPr>
+        <w:t xml:space="preserve">No borre los datos del navegador. Ahí están sus órdenes y las operaciones pendientes.</w:t>
+      </w:r>
+    </w:p>
+    <w:p>
+      <w:pPr>
+        <w:keepNext/>
+        <w:spacing w:after="0" w:before="0" w:line="480" w:lineRule="auto"/>
+      </w:pPr>
+      <w:r>
+        <w:rPr>
+          <w:rFonts w:ascii="Times New Roman" w:cs="Times New Roman" w:eastAsia="Times New Roman" w:hAnsi="Times New Roman"/>
+          <w:b/>
+          <w:bCs/>
+          <w:color w:val="000000"/>
+          <w:sz w:val="24"/>
+          <w:szCs w:val="24"/>
+        </w:rPr>
+        <w:t xml:space="preserve">En campo, para registrar un corte:</w:t>
       </w:r>
     </w:p>
     <w:p>
@@ -1183,7 +3164,7 @@
           <w:sz w:val="24"/>
           <w:szCs w:val="24"/>
         </w:rPr>
-        <w:t xml:space="preserve">Revise que la parte superior de la pantalla diga Red disponible.</w:t>
+        <w:t xml:space="preserve">En la pantalla Jornada de campo, pulse Abrir orden. Revise el nombre, la dirección y la deuda.</w:t>
       </w:r>
     </w:p>
     <w:p>
@@ -1202,7 +3183,102 @@
           <w:sz w:val="24"/>
           <w:szCs w:val="24"/>
         </w:rPr>
-        <w:t xml:space="preserve">No borre los datos del navegador. Ahí están sus órdenes y las operaciones pendientes.</w:t>
+        <w:t xml:space="preserve">Pulse Registrar corte (Figura 3).</w:t>
+      </w:r>
+    </w:p>
+    <w:p>
+      <w:pPr>
+        <w:pStyle w:val="ListParagraph"/>
+        <w:numPr>
+          <w:ilvl w:val="0"/>
+          <w:numId w:val="5"/>
+        </w:numPr>
+        <w:spacing w:after="0" w:before="0" w:line="480" w:lineRule="auto"/>
+      </w:pPr>
+      <w:r>
+        <w:rPr>
+          <w:rFonts w:ascii="Times New Roman" w:cs="Times New Roman" w:eastAsia="Times New Roman" w:hAnsi="Times New Roman"/>
+          <w:color w:val="000000"/>
+          <w:sz w:val="24"/>
+          <w:szCs w:val="24"/>
+        </w:rPr>
+        <w:t xml:space="preserve">Escriba la lectura final del medidor, en kWh. Debe ser un número no negativo y corresponder al medidor correcto.</w:t>
+      </w:r>
+    </w:p>
+    <w:p>
+      <w:pPr>
+        <w:pStyle w:val="ListParagraph"/>
+        <w:numPr>
+          <w:ilvl w:val="0"/>
+          <w:numId w:val="5"/>
+        </w:numPr>
+        <w:spacing w:after="0" w:before="0" w:line="480" w:lineRule="auto"/>
+      </w:pPr>
+      <w:r>
+        <w:rPr>
+          <w:rFonts w:ascii="Times New Roman" w:cs="Times New Roman" w:eastAsia="Times New Roman" w:hAnsi="Times New Roman"/>
+          <w:color w:val="000000"/>
+          <w:sz w:val="24"/>
+          <w:szCs w:val="24"/>
+        </w:rPr>
+        <w:t xml:space="preserve">Obtenga la ubicación GPS. Si no se obtiene, escriba el motivo.</w:t>
+      </w:r>
+    </w:p>
+    <w:p>
+      <w:pPr>
+        <w:pStyle w:val="ListParagraph"/>
+        <w:numPr>
+          <w:ilvl w:val="0"/>
+          <w:numId w:val="5"/>
+        </w:numPr>
+        <w:spacing w:after="0" w:before="0" w:line="480" w:lineRule="auto"/>
+      </w:pPr>
+      <w:r>
+        <w:rPr>
+          <w:rFonts w:ascii="Times New Roman" w:cs="Times New Roman" w:eastAsia="Times New Roman" w:hAnsi="Times New Roman"/>
+          <w:color w:val="000000"/>
+          <w:sz w:val="24"/>
+          <w:szCs w:val="24"/>
+        </w:rPr>
+        <w:t xml:space="preserve">Tome la fotografía en JPEG o PNG. Si no es posible, escriba la justificación obligatoria (Figura 4).</w:t>
+      </w:r>
+    </w:p>
+    <w:p>
+      <w:pPr>
+        <w:pStyle w:val="ListParagraph"/>
+        <w:numPr>
+          <w:ilvl w:val="0"/>
+          <w:numId w:val="5"/>
+        </w:numPr>
+        <w:spacing w:after="0" w:before="0" w:line="480" w:lineRule="auto"/>
+      </w:pPr>
+      <w:r>
+        <w:rPr>
+          <w:rFonts w:ascii="Times New Roman" w:cs="Times New Roman" w:eastAsia="Times New Roman" w:hAnsi="Times New Roman"/>
+          <w:color w:val="000000"/>
+          <w:sz w:val="24"/>
+          <w:szCs w:val="24"/>
+        </w:rPr>
+        <w:t xml:space="preserve">Espere la autorización en línea. La aplicación solo permite cortar si el servidor la confirma.</w:t>
+      </w:r>
+    </w:p>
+    <w:p>
+      <w:pPr>
+        <w:pStyle w:val="ListParagraph"/>
+        <w:numPr>
+          <w:ilvl w:val="0"/>
+          <w:numId w:val="5"/>
+        </w:numPr>
+        <w:spacing w:after="0" w:before="0" w:line="480" w:lineRule="auto"/>
+      </w:pPr>
+      <w:r>
+        <w:rPr>
+          <w:rFonts w:ascii="Times New Roman" w:cs="Times New Roman" w:eastAsia="Times New Roman" w:hAnsi="Times New Roman"/>
+          <w:color w:val="000000"/>
+          <w:sz w:val="24"/>
+          <w:szCs w:val="24"/>
+        </w:rPr>
+        <w:t xml:space="preserve">Confirme el corte. La operación queda como Pendiente hasta que el servidor la confirme; después aparece como Sincronizado.</w:t>
       </w:r>
     </w:p>
     <w:p>
@@ -1219,7 +3295,7 @@
           <w:sz w:val="24"/>
           <w:szCs w:val="24"/>
         </w:rPr>
-        <w:t xml:space="preserve">En campo, para registrar un corte:</w:t>
+        <w:t xml:space="preserve">Si no puede cortar:</w:t>
       </w:r>
     </w:p>
     <w:p>
@@ -1238,121 +3314,7 @@
           <w:sz w:val="24"/>
           <w:szCs w:val="24"/>
         </w:rPr>
-        <w:t xml:space="preserve">En la pantalla Jornada de campo, pulse Abrir orden. Revise el nombre, la dirección y la deuda.</w:t>
-      </w:r>
-    </w:p>
-    <w:p>
-      <w:pPr>
-        <w:pStyle w:val="ListParagraph"/>
-        <w:numPr>
-          <w:ilvl w:val="0"/>
-          <w:numId w:val="6"/>
-        </w:numPr>
-        <w:spacing w:after="0" w:before="0" w:line="480" w:lineRule="auto"/>
-      </w:pPr>
-      <w:r>
-        <w:rPr>
-          <w:rFonts w:ascii="Times New Roman" w:cs="Times New Roman" w:eastAsia="Times New Roman" w:hAnsi="Times New Roman"/>
-          <w:color w:val="000000"/>
-          <w:sz w:val="24"/>
-          <w:szCs w:val="24"/>
-        </w:rPr>
-        <w:t xml:space="preserve">Pulse Registrar corte (Figura 3).</w:t>
-      </w:r>
-    </w:p>
-    <w:p>
-      <w:pPr>
-        <w:pStyle w:val="ListParagraph"/>
-        <w:numPr>
-          <w:ilvl w:val="0"/>
-          <w:numId w:val="6"/>
-        </w:numPr>
-        <w:spacing w:after="0" w:before="0" w:line="480" w:lineRule="auto"/>
-      </w:pPr>
-      <w:r>
-        <w:rPr>
-          <w:rFonts w:ascii="Times New Roman" w:cs="Times New Roman" w:eastAsia="Times New Roman" w:hAnsi="Times New Roman"/>
-          <w:color w:val="000000"/>
-          <w:sz w:val="24"/>
-          <w:szCs w:val="24"/>
-        </w:rPr>
-        <w:t xml:space="preserve">Escriba la lectura final del medidor, en kWh. Debe ser un número no negativo y corresponder al medidor correcto.</w:t>
-      </w:r>
-    </w:p>
-    <w:p>
-      <w:pPr>
-        <w:pStyle w:val="ListParagraph"/>
-        <w:numPr>
-          <w:ilvl w:val="0"/>
-          <w:numId w:val="6"/>
-        </w:numPr>
-        <w:spacing w:after="0" w:before="0" w:line="480" w:lineRule="auto"/>
-      </w:pPr>
-      <w:r>
-        <w:rPr>
-          <w:rFonts w:ascii="Times New Roman" w:cs="Times New Roman" w:eastAsia="Times New Roman" w:hAnsi="Times New Roman"/>
-          <w:color w:val="000000"/>
-          <w:sz w:val="24"/>
-          <w:szCs w:val="24"/>
-        </w:rPr>
-        <w:t xml:space="preserve">Obtenga la ubicación GPS. Si no se obtiene, escriba el motivo.</w:t>
-      </w:r>
-    </w:p>
-    <w:p>
-      <w:pPr>
-        <w:pStyle w:val="ListParagraph"/>
-        <w:numPr>
-          <w:ilvl w:val="0"/>
-          <w:numId w:val="6"/>
-        </w:numPr>
-        <w:spacing w:after="0" w:before="0" w:line="480" w:lineRule="auto"/>
-      </w:pPr>
-      <w:r>
-        <w:rPr>
-          <w:rFonts w:ascii="Times New Roman" w:cs="Times New Roman" w:eastAsia="Times New Roman" w:hAnsi="Times New Roman"/>
-          <w:color w:val="000000"/>
-          <w:sz w:val="24"/>
-          <w:szCs w:val="24"/>
-        </w:rPr>
-        <w:t xml:space="preserve">Tome la fotografía en JPEG o PNG. Si no es posible, escriba la justificación obligatoria (Figura 4).</w:t>
-      </w:r>
-    </w:p>
-    <w:p>
-      <w:pPr>
-        <w:pStyle w:val="ListParagraph"/>
-        <w:numPr>
-          <w:ilvl w:val="0"/>
-          <w:numId w:val="6"/>
-        </w:numPr>
-        <w:spacing w:after="0" w:before="0" w:line="480" w:lineRule="auto"/>
-      </w:pPr>
-      <w:r>
-        <w:rPr>
-          <w:rFonts w:ascii="Times New Roman" w:cs="Times New Roman" w:eastAsia="Times New Roman" w:hAnsi="Times New Roman"/>
-          <w:color w:val="000000"/>
-          <w:sz w:val="24"/>
-          <w:szCs w:val="24"/>
-        </w:rPr>
-        <w:t xml:space="preserve">Espere la autorización en línea. La aplicación solo permite cortar si el servidor la confirma.</w:t>
-      </w:r>
-    </w:p>
-    <w:p>
-      <w:pPr>
-        <w:pStyle w:val="ListParagraph"/>
-        <w:numPr>
-          <w:ilvl w:val="0"/>
-          <w:numId w:val="6"/>
-        </w:numPr>
-        <w:spacing w:after="0" w:before="0" w:line="480" w:lineRule="auto"/>
-      </w:pPr>
-      <w:r>
-        <w:rPr>
-          <w:rFonts w:ascii="Times New Roman" w:cs="Times New Roman" w:eastAsia="Times New Roman" w:hAnsi="Times New Roman"/>
-          <w:color w:val="000000"/>
-          <w:sz w:val="24"/>
-          <w:szCs w:val="24"/>
-        </w:rPr>
-        <w:t xml:space="preserve">Confirme el corte. La operación queda como Pendiente hasta que el servidor la confirme; después aparece como Sincronizado.</w:t>
+        <w:t xml:space="preserve">Pulse Registrar visita. Esto registra su presencia y no afirma que hubo corte. Si la autorización fue rechazada o no es clara, no se corta.</w:t>
       </w:r>
     </w:p>
     <w:p>
@@ -1369,7 +3331,7 @@
           <w:sz w:val="24"/>
           <w:szCs w:val="24"/>
         </w:rPr>
-        <w:t xml:space="preserve">Si no puede cortar:</w:t>
+        <w:t xml:space="preserve">Si una operación queda en revisión:</w:t>
       </w:r>
     </w:p>
     <w:p>
@@ -1388,7 +3350,26 @@
           <w:sz w:val="24"/>
           <w:szCs w:val="24"/>
         </w:rPr>
-        <w:t xml:space="preserve">Pulse Registrar visita. Esto registra su presencia y no afirma que hubo corte. Si la autorización fue rechazada o no es clara, no se corta.</w:t>
+        <w:t xml:space="preserve">Pulse Verificar con servidor. La aplicación vuelve a consultar la autorización con el mismo identificador.</w:t>
+      </w:r>
+    </w:p>
+    <w:p>
+      <w:pPr>
+        <w:pStyle w:val="ListParagraph"/>
+        <w:numPr>
+          <w:ilvl w:val="0"/>
+          <w:numId w:val="7"/>
+        </w:numPr>
+        <w:spacing w:after="0" w:before="0" w:line="480" w:lineRule="auto"/>
+      </w:pPr>
+      <w:r>
+        <w:rPr>
+          <w:rFonts w:ascii="Times New Roman" w:cs="Times New Roman" w:eastAsia="Times New Roman" w:hAnsi="Times New Roman"/>
+          <w:color w:val="000000"/>
+          <w:sz w:val="24"/>
+          <w:szCs w:val="24"/>
+        </w:rPr>
+        <w:t xml:space="preserve">No repita la acción en campo mientras la respuesta no sea concluyente. Si la operación dice Revisión humana · no reenviar, avise al administrador.</w:t>
       </w:r>
     </w:p>
     <w:p>
@@ -1405,7 +3386,7 @@
           <w:sz w:val="24"/>
           <w:szCs w:val="24"/>
         </w:rPr>
-        <w:t xml:space="preserve">Si una operación queda en revisión:</w:t>
+        <w:t xml:space="preserve">Para consultar lo ya sincronizado desde otro teléfono:</w:t>
       </w:r>
     </w:p>
     <w:p>
@@ -1414,61 +3395,6 @@
         <w:numPr>
           <w:ilvl w:val="0"/>
           <w:numId w:val="8"/>
-        </w:numPr>
-        <w:spacing w:after="0" w:before="0" w:line="480" w:lineRule="auto"/>
-      </w:pPr>
-      <w:r>
-        <w:rPr>
-          <w:rFonts w:ascii="Times New Roman" w:cs="Times New Roman" w:eastAsia="Times New Roman" w:hAnsi="Times New Roman"/>
-          <w:color w:val="000000"/>
-          <w:sz w:val="24"/>
-          <w:szCs w:val="24"/>
-        </w:rPr>
-        <w:t xml:space="preserve">Pulse Verificar con servidor. La aplicación vuelve a consultar la autorización con el mismo identificador.</w:t>
-      </w:r>
-    </w:p>
-    <w:p>
-      <w:pPr>
-        <w:pStyle w:val="ListParagraph"/>
-        <w:numPr>
-          <w:ilvl w:val="0"/>
-          <w:numId w:val="8"/>
-        </w:numPr>
-        <w:spacing w:after="0" w:before="0" w:line="480" w:lineRule="auto"/>
-      </w:pPr>
-      <w:r>
-        <w:rPr>
-          <w:rFonts w:ascii="Times New Roman" w:cs="Times New Roman" w:eastAsia="Times New Roman" w:hAnsi="Times New Roman"/>
-          <w:color w:val="000000"/>
-          <w:sz w:val="24"/>
-          <w:szCs w:val="24"/>
-        </w:rPr>
-        <w:t xml:space="preserve">No repita la acción en campo mientras la respuesta no sea concluyente. Si la operación dice Revisión humana · no reenviar, avise al administrador.</w:t>
-      </w:r>
-    </w:p>
-    <w:p>
-      <w:pPr>
-        <w:keepNext/>
-        <w:spacing w:after="0" w:before="0" w:line="480" w:lineRule="auto"/>
-      </w:pPr>
-      <w:r>
-        <w:rPr>
-          <w:rFonts w:ascii="Times New Roman" w:cs="Times New Roman" w:eastAsia="Times New Roman" w:hAnsi="Times New Roman"/>
-          <w:b/>
-          <w:bCs/>
-          <w:color w:val="000000"/>
-          <w:sz w:val="24"/>
-          <w:szCs w:val="24"/>
-        </w:rPr>
-        <w:t xml:space="preserve">Para consultar lo ya sincronizado desde otro teléfono:</w:t>
-      </w:r>
-    </w:p>
-    <w:p>
-      <w:pPr>
-        <w:pStyle w:val="ListParagraph"/>
-        <w:numPr>
-          <w:ilvl w:val="0"/>
-          <w:numId w:val="9"/>
         </w:numPr>
         <w:spacing w:after="0" w:before="0" w:line="480" w:lineRule="auto"/>
       </w:pPr>
@@ -2786,36 +4712,30 @@
     </w:lvlOverride>
   </w:num>
   <w:num w:numId="4">
-    <w:abstractNumId w:val="7"/>
+    <w:abstractNumId w:val="2"/>
     <w:lvlOverride w:ilvl="0">
       <w:startOverride w:val="1"/>
     </w:lvlOverride>
   </w:num>
   <w:num w:numId="5">
-    <w:abstractNumId w:val="2"/>
+    <w:abstractNumId w:val="3"/>
     <w:lvlOverride w:ilvl="0">
       <w:startOverride w:val="1"/>
     </w:lvlOverride>
   </w:num>
   <w:num w:numId="6">
-    <w:abstractNumId w:val="3"/>
+    <w:abstractNumId w:val="4"/>
     <w:lvlOverride w:ilvl="0">
       <w:startOverride w:val="1"/>
     </w:lvlOverride>
   </w:num>
   <w:num w:numId="7">
-    <w:abstractNumId w:val="4"/>
+    <w:abstractNumId w:val="5"/>
     <w:lvlOverride w:ilvl="0">
       <w:startOverride w:val="1"/>
     </w:lvlOverride>
   </w:num>
   <w:num w:numId="8">
-    <w:abstractNumId w:val="5"/>
-    <w:lvlOverride w:ilvl="0">
-      <w:startOverride w:val="1"/>
-    </w:lvlOverride>
-  </w:num>
-  <w:num w:numId="9">
     <w:abstractNumId w:val="6"/>
     <w:lvlOverride w:ilvl="0">
       <w:startOverride w:val="1"/>

</xml_diff>